<commit_message>
Draft_020 excel full-pass inventory; Acs9 indicated FP-Gen in docx
</commit_message>
<xml_diff>
--- a/thesis/003_ThesisProposal_Draft_107.docx
+++ b/thesis/003_ThesisProposal_Draft_107.docx
@@ -25532,55 +25532,75 @@
       <w:r>
         <w:rPr>
           <w:rFonts w:ascii="Georgia" w:hAnsi="Georgia" w:cs="Georgia"/>
-          <w:b w:val="0"/>
-          <w:strike w:val="0"/>
-          <w:sz w:val="22"/>
-        </w:rPr>
-        <w:t xml:space="preserve">A field experiment was conducted from December 2024 to January 2025 in [REDACTED], to evaluate the effects of varying soaking durations in Azospirillum spp. biofertilizer on the early growth and development of sugarcane (Saccharum officinarum) setts. The study employed a Randomized Complete Block Design (RCBD) with four treatments: T1 (24-hour water soak, control), T2 (24-hour Azospirillum spp. soak), T3 (20-hour Azospirillum spp. soak), and T4 (16-hour Azospirillum spp. soak), each replicated three times. Parameters assessed included percentage of survival, root elongation rate, root area, fresh root and shoot biomass, and root-to-shoot ratio. Results indicated that the 24-hour Azospirillum spp. treatment (T2) significantly enhanced survival rates on Days 8 and 11, root elongation rate, root area, fresh root and shoot biomass, compared to the control. However, no significant differences were observed in root-to-shoot ratio among the treatments. These findings </w:t>
+          <w:strike w:val="0"/>
+          <w:sz w:val="22"/>
+        </w:rPr>
+        <w:t xml:space="preserve">A field experiment was conducted from December 2024 to January 2025 in [REDACTED], to evaluate the effects of varying soaking durations in Azospirillum spp. biofertilizer on the early growth and development of sugarcane (Saccharum officinarum) setts. The study employed a Randomized Complete Block Design (RCBD) with four treatments: T1 (24-hour water soak, control), T2 (24-hour Azospirillum spp. soak), T3 (20-hour Azospirillum spp. soak), and T4 (16-hour Azospirillum spp. soak), each replicated three times. Parameters assessed included percentage of survival, root elongation rate, root area, fresh root and shoot biomass, and root-to-shoot ratio. Results </w:t>
       </w:r>
       <w:r>
         <w:rPr>
           <w:rFonts w:ascii="Georgia" w:hAnsi="Georgia" w:cs="Georgia"/>
-          <w:b w:val="0"/>
-          <w:strike w:val="0"/>
-          <w:sz w:val="22"/>
-          <w:highlight w:val="yellow"/>
-        </w:rPr>
-        <w:t>suggest</w:t>
-      </w:r>
-      <w:r>
-        <w:rPr>
-          <w:rFonts w:ascii="Georgia" w:hAnsi="Georgia" w:cs="Georgia"/>
-          <w:b w:val="0"/>
-          <w:strike w:val="0"/>
-          <w:color w:val="0070C0"/>
-          <w:sz w:val="22"/>
-        </w:rPr>
-        <w:t xml:space="preserve"> (EC)</w:t>
-      </w:r>
-      <w:r>
-        <w:rPr>
-          <w:rFonts w:ascii="Georgia" w:hAnsi="Georgia" w:cs="Georgia"/>
-          <w:b w:val="0"/>
-          <w:strike w:val="0"/>
-          <w:sz w:val="22"/>
-        </w:rPr>
-        <w:t xml:space="preserve"> that soaking sugarcane setts in Azospirillum spp. biofertilizer for 24 hours </w:t>
-      </w:r>
-      <w:r>
-        <w:rPr>
-          <w:rFonts w:ascii="Georgia" w:hAnsi="Georgia" w:cs="Georgia"/>
-          <w:b w:val="0"/>
           <w:strike/>
           <w:color w:val="808080"/>
           <w:sz w:val="22"/>
         </w:rPr>
+        <w:t>indicated</w:t>
+      </w:r>
+      <w:r>
+        <w:rPr>
+          <w:rFonts w:ascii="Georgia" w:hAnsi="Georgia" w:cs="Georgia"/>
+          <w:strike w:val="0"/>
+          <w:color w:val="808080"/>
+          <w:sz w:val="22"/>
+        </w:rPr>
+        <w:t xml:space="preserve"> (FP-Gen)</w:t>
+      </w:r>
+      <w:r>
+        <w:rPr>
+          <w:rFonts w:ascii="Georgia" w:hAnsi="Georgia" w:cs="Georgia"/>
+          <w:strike w:val="0"/>
+          <w:sz w:val="22"/>
+        </w:rPr>
+        <w:t xml:space="preserve"> that the 24-hour Azospirillum spp. treatment (T2) significantly enhanced survival rates on Days 8 and 11, root elongation rate, root area, fresh root and shoot biomass, compared to the control. However, no significant differences were observed in root-to-shoot ratio among the treatments. These findings </w:t>
+      </w:r>
+      <w:r>
+        <w:rPr>
+          <w:rFonts w:ascii="Georgia" w:hAnsi="Georgia" w:cs="Georgia"/>
+          <w:strike w:val="0"/>
+          <w:sz w:val="22"/>
+          <w:highlight w:val="yellow"/>
+        </w:rPr>
+        <w:t>suggest</w:t>
+      </w:r>
+      <w:r>
+        <w:rPr>
+          <w:rFonts w:ascii="Georgia" w:hAnsi="Georgia" w:cs="Georgia"/>
+          <w:strike w:val="0"/>
+          <w:color w:val="0070C0"/>
+          <w:sz w:val="22"/>
+        </w:rPr>
+        <w:t xml:space="preserve"> (EC)</w:t>
+      </w:r>
+      <w:r>
+        <w:rPr>
+          <w:rFonts w:ascii="Georgia" w:hAnsi="Georgia" w:cs="Georgia"/>
+          <w:strike w:val="0"/>
+          <w:sz w:val="22"/>
+        </w:rPr>
+        <w:t xml:space="preserve"> that soaking sugarcane setts in Azospirillum spp. biofertilizer for 24 hours </w:t>
+      </w:r>
+      <w:r>
+        <w:rPr>
+          <w:rFonts w:ascii="Georgia" w:hAnsi="Georgia" w:cs="Georgia"/>
+          <w:strike/>
+          <w:color w:val="808080"/>
+          <w:sz w:val="22"/>
+        </w:rPr>
         <w:t>can</w:t>
       </w:r>
       <w:r>
         <w:rPr>
           <w:rFonts w:ascii="Georgia" w:hAnsi="Georgia" w:cs="Georgia"/>
-          <w:b w:val="0"/>
           <w:strike w:val="0"/>
           <w:color w:val="808080"/>
           <w:sz w:val="22"/>
@@ -25590,7 +25610,6 @@
       <w:r>
         <w:rPr>
           <w:rFonts w:ascii="Georgia" w:hAnsi="Georgia" w:cs="Georgia"/>
-          <w:b w:val="0"/>
           <w:strike w:val="0"/>
           <w:sz w:val="22"/>
         </w:rPr>

</xml_diff>

<commit_message>
Draft_107: full-pass indicate audit; Aas3 indicates EC; totals 65/65
</commit_message>
<xml_diff>
--- a/thesis/003_ThesisProposal_Draft_107.docx
+++ b/thesis/003_ThesisProposal_Draft_107.docx
@@ -1636,7 +1636,7 @@
           <w:strike w:val="0"/>
           <w:sz w:val="22"/>
         </w:rPr>
-        <w:t>Reliability rests on intra-rater agreement on six abstracts and adviser review of the coded data. A second coder was not available for inter-rater reliability testing, which limits how far the coding scheme can be verified against an independent application of the same decision rules. That limit bears especially on the functional findings in Part III. Assigning all 64 retained hedges to Epistemic Caution may reflect one coder’s frame as much as a property of the corpus. Inter-rater coding on at least a subset of the corpus is needed before those functional results can be treated as established.</w:t>
+        <w:t>Reliability rests on intra-rater agreement on six abstracts and adviser review of the coded data. A second coder was not available for inter-rater reliability testing, which limits how far the coding scheme can be verified against an independent application of the same decision rules. That limit bears especially on the functional findings in Part III. Assigning all 65 retained hedges to Epistemic Caution may reflect one coder’s frame as much as a property of the corpus. Inter-rater coding on at least a subset of the corpus is needed before those functional results can be treated as established.</w:t>
       </w:r>
     </w:p>
     <w:p>
@@ -4443,7 +4443,7 @@
           <w:strike w:val="0"/>
           <w:sz w:val="22"/>
         </w:rPr>
-        <w:t>The coding identified 64 hedge tokens across the 60-abstract corpus, or about 1.07 hedges per abstract. That is about half the 2.04 hedges per abstract Hu and Cao (2011) reported for English-medium applied linguistics journals, though the field and writers differ. These tokens were classified into four types following Hyland’s (1998) taxonomy: modal verbs, lexical hedges, adverbial hedges, and clause-level hedges. Table 2 presents the distribution of hedge types across the full corpus.</w:t>
+        <w:t>The coding identified 65 hedge tokens across the 60-abstract corpus, or about 1.08 hedges per abstract. That is about half the 2.04 hedges per abstract Hu and Cao (2011) reported for English-medium applied linguistics journals, though the field and writers differ. These tokens were classified into four types following Hyland’s (1998) taxonomy: modal verbs, lexical hedges, adverbial hedges, and clause-level hedges. Table 2 presents the distribution of hedge types across the full corpus.</w:t>
       </w:r>
     </w:p>
     <w:p>
@@ -4685,7 +4685,7 @@
                 <w:rFonts w:ascii="Georgia" w:hAnsi="Georgia"/>
                 <w:sz w:val="22"/>
               </w:rPr>
-              <w:t>31.3%</w:t>
+              <w:t>30.8%</w:t>
             </w:r>
           </w:p>
         </w:tc>
@@ -4737,7 +4737,7 @@
                 <w:rFonts w:ascii="Georgia" w:hAnsi="Georgia"/>
                 <w:sz w:val="22"/>
               </w:rPr>
-              <w:t>41</w:t>
+              <w:t>42</w:t>
             </w:r>
           </w:p>
         </w:tc>
@@ -4756,7 +4756,7 @@
                 <w:rFonts w:ascii="Georgia" w:hAnsi="Georgia"/>
                 <w:sz w:val="22"/>
               </w:rPr>
-              <w:t>64.1%</w:t>
+              <w:t>64.6%</w:t>
             </w:r>
           </w:p>
         </w:tc>
@@ -4827,7 +4827,7 @@
                 <w:rFonts w:ascii="Georgia" w:hAnsi="Georgia"/>
                 <w:sz w:val="22"/>
               </w:rPr>
-              <w:t>4.7%</w:t>
+              <w:t>4.6%</w:t>
             </w:r>
           </w:p>
         </w:tc>
@@ -4974,7 +4974,7 @@
                 <w:rFonts w:ascii="Georgia" w:hAnsi="Georgia"/>
                 <w:sz w:val="22"/>
               </w:rPr>
-              <w:t>64</w:t>
+              <w:t>65</w:t>
             </w:r>
           </w:p>
         </w:tc>
@@ -5017,7 +5017,7 @@
           <w:strike w:val="0"/>
           <w:sz w:val="22"/>
         </w:rPr>
-        <w:t>Table 2 presents the overall distribution of hedge types. Lexical hedges dominated the corpus with 41 instances (64.1%), followed by modal verbs with 20 instances (31.3%), and adverbial hedges with 3 instances (4.7%). No clause-level hedges were identified in any of the 60 abstracts. The literature reports modal verbs as the most frequent hedge type in developing researchers' writing (Khunasathitchai et al., 2025; Wang, 2022). This corpus differs: lexical hedges outnumber modal verbs.</w:t>
+        <w:t>Table 2 presents the overall distribution of hedge types. Lexical hedges dominated the corpus with 42 instances (64.6%), followed by modal verbs with 20 instances (30.8%), and adverbial hedges with 3 instances (4.7%). No clause-level hedges were identified in any of the 60 abstracts. The literature reports modal verbs as the most frequent hedge type in developing researchers' writing (Khunasathitchai et al., 2025; Wang, 2022). This corpus differs: lexical hedges outnumber modal verbs.</w:t>
       </w:r>
     </w:p>
     <w:p>
@@ -5034,7 +5034,7 @@
           <w:strike w:val="0"/>
           <w:sz w:val="22"/>
         </w:rPr>
-        <w:t>Within the lexical hedge category, the token “potential” accounted for 19 of the 41 lexical instances (46.3%), the single most frequent hedge token in the corpus. Other frequent lexical forms, grouped by root, included “suggest / suggests / suggesting” (13), “imply / implies / implying” (3), and “indicating” (2). Modal verbs were led by “could” (6), “may” (6), “can” (5), and “might” (3). The 19 potential instances show recurring frames such as “the potential of X as a Y,” “has potential as an X,” and “highlight their potential as X.” Whether those uses express epistemic caution or topic-naming evaluation remains a boundary judgment under the Working Test and is open to alternative readings. Without these 19 tokens, lexical hedges number 22 against 21 modal verbs, so the lexical lead rests on how “potential” is read. Agriculture and Biology account for 15 of the 19 instances. Veterinary Medicine accounts for 4. In scientific English, however, content-oriented lexical hedges often carry more of the epistemic load than modals alone (Hyland, 1998). The dominance of potential fits that pattern in applied-life-science abstracts. Writers reach for a ready English formula that softens application claims (“has potential as…”, “highlight their potential as…”) without building longer clause-level stance. Related work on scientific research writing supports a lexical emphasis. Hyland (1996b) shows that hedging in molecular biology articles is realized mainly by surface lexical forms, with epistemic lexical verbs the largest and most varied group and items such as suggest and indicate among the most frequent. Biologists in that corpus also used fewer modal verbs than writers in general academic English. The present lexical-led profile, driven by potential and suggest in application and implication frames, therefore aligns more with the scientific pattern than with the modal-heavy student pattern.</w:t>
+        <w:t>Within the lexical hedge category, the token “potential” accounted for 19 of the 42 lexical instances (45.2%), the single most frequent hedge token in the corpus. Other frequent lexical forms, grouped by root, included “suggest / suggests / suggesting” (13), “imply / implies / implying” (3), and “indicating / indicates” (3). Modal verbs were led by “could” (6), “may” (6), “can” (5), and “might” (3). The 19 potential instances show recurring frames such as “the potential of X as a Y,” “has potential as an X,” and “highlight their potential as X.” Whether those uses express epistemic caution or topic-naming evaluation remains a boundary judgment under the Working Test and is open to alternative readings. Without these 19 tokens, lexical hedges number 22 against 21 modal verbs, so the lexical lead rests on how “potential” is read. Agriculture and Biology account for 15 of the 19 instances. Veterinary Medicine accounts for 4. In scientific English, however, content-oriented lexical hedges often carry more of the epistemic load than modals alone (Hyland, 1998). The dominance of potential fits that pattern in applied-life-science abstracts. Writers reach for a ready English formula that softens application claims (“has potential as…”, “highlight their potential as…”) without building longer clause-level stance. Related work on scientific research writing supports a lexical emphasis. Hyland (1996b) shows that hedging in molecular biology articles is realized mainly by surface lexical forms, with epistemic lexical verbs the largest and most varied group and items such as suggest and indicate among the most frequent. Biologists in that corpus also used fewer modal verbs than writers in general academic English. The present lexical-led profile, driven by potential and suggest in application and implication frames, therefore aligns more with the scientific pattern than with the modal-heavy student pattern.</w:t>
       </w:r>
     </w:p>
     <w:p>
@@ -5327,7 +5327,7 @@
                 <w:rFonts w:ascii="Georgia" w:hAnsi="Georgia"/>
                 <w:sz w:val="22"/>
               </w:rPr>
-              <w:t>29.7%</w:t>
+              <w:t>29.2%</w:t>
             </w:r>
           </w:p>
         </w:tc>
@@ -5416,7 +5416,7 @@
                 <w:rFonts w:ascii="Georgia" w:hAnsi="Georgia"/>
                 <w:sz w:val="22"/>
               </w:rPr>
-              <w:t>10.9%</w:t>
+              <w:t>10.8%</w:t>
             </w:r>
           </w:p>
         </w:tc>
@@ -5505,7 +5505,7 @@
                 <w:rFonts w:ascii="Georgia" w:hAnsi="Georgia"/>
                 <w:sz w:val="22"/>
               </w:rPr>
-              <w:t>4.7%</w:t>
+              <w:t>4.6%</w:t>
             </w:r>
           </w:p>
         </w:tc>
@@ -5594,7 +5594,7 @@
                 <w:rFonts w:ascii="Georgia" w:hAnsi="Georgia"/>
                 <w:sz w:val="22"/>
               </w:rPr>
-              <w:t>4.7%</w:t>
+              <w:t>4.6%</w:t>
             </w:r>
           </w:p>
         </w:tc>
@@ -5710,7 +5710,7 @@
                 <w:szCs w:val="18"/>
                 <w:rtl w:val="0"/>
               </w:rPr>
-              <w:t xml:space="preserve">indicating</w:t>
+              <w:t xml:space="preserve">indicating / indicates</w:t>
             </w:r>
           </w:p>
         </w:tc>
@@ -5752,7 +5752,7 @@
                 <w:szCs w:val="18"/>
                 <w:rtl w:val="0"/>
               </w:rPr>
-              <w:t xml:space="preserve">2</w:t>
+              <w:t xml:space="preserve">3</w:t>
             </w:r>
           </w:p>
         </w:tc>
@@ -5772,7 +5772,7 @@
                 <w:rFonts w:ascii="Georgia" w:hAnsi="Georgia"/>
                 <w:sz w:val="22"/>
               </w:rPr>
-              <w:t>3.1%</w:t>
+              <w:t>4.6%</w:t>
             </w:r>
           </w:p>
         </w:tc>
@@ -5950,7 +5950,7 @@
                 <w:rFonts w:ascii="Georgia" w:hAnsi="Georgia"/>
                 <w:sz w:val="22"/>
               </w:rPr>
-              <w:t>1.6%</w:t>
+              <w:t>1.5%</w:t>
             </w:r>
           </w:p>
         </w:tc>
@@ -6039,7 +6039,7 @@
                 <w:rFonts w:ascii="Georgia" w:hAnsi="Georgia"/>
                 <w:sz w:val="22"/>
               </w:rPr>
-              <w:t>1.6%</w:t>
+              <w:t>1.5%</w:t>
             </w:r>
           </w:p>
         </w:tc>
@@ -6128,7 +6128,7 @@
                 <w:rFonts w:ascii="Georgia" w:hAnsi="Georgia"/>
                 <w:sz w:val="22"/>
               </w:rPr>
-              <w:t>1.6%</w:t>
+              <w:t>1.5%</w:t>
             </w:r>
           </w:p>
         </w:tc>
@@ -6216,7 +6216,7 @@
                 <w:rFonts w:ascii="Georgia" w:hAnsi="Georgia"/>
                 <w:sz w:val="22"/>
               </w:rPr>
-              <w:t>7.8%</w:t>
+              <w:t>7.7%</w:t>
             </w:r>
           </w:p>
         </w:tc>
@@ -6305,7 +6305,7 @@
                 <w:rFonts w:ascii="Georgia" w:hAnsi="Georgia"/>
                 <w:sz w:val="22"/>
               </w:rPr>
-              <w:t>9.4%</w:t>
+              <w:t>9.2%</w:t>
             </w:r>
           </w:p>
         </w:tc>
@@ -6394,7 +6394,7 @@
                 <w:rFonts w:ascii="Georgia" w:hAnsi="Georgia"/>
                 <w:sz w:val="22"/>
               </w:rPr>
-              <w:t>9.4%</w:t>
+              <w:t>9.2%</w:t>
             </w:r>
           </w:p>
         </w:tc>
@@ -6483,7 +6483,7 @@
                 <w:rFonts w:ascii="Georgia" w:hAnsi="Georgia"/>
                 <w:sz w:val="22"/>
               </w:rPr>
-              <w:t>4.7%</w:t>
+              <w:t>4.6%</w:t>
             </w:r>
           </w:p>
         </w:tc>
@@ -6572,7 +6572,7 @@
                 <w:rFonts w:ascii="Georgia" w:hAnsi="Georgia"/>
                 <w:sz w:val="22"/>
               </w:rPr>
-              <w:t>4.7%</w:t>
+              <w:t>4.6%</w:t>
             </w:r>
           </w:p>
         </w:tc>
@@ -6652,7 +6652,7 @@
                 <w:rFonts w:ascii="Georgia" w:hAnsi="Georgia"/>
                 <w:sz w:val="22"/>
               </w:rPr>
-              <w:t>64</w:t>
+              <w:t>65</w:t>
             </w:r>
           </w:p>
         </w:tc>
@@ -7074,7 +7074,7 @@
                 <w:rFonts w:ascii="Georgia" w:hAnsi="Georgia"/>
                 <w:sz w:val="22"/>
               </w:rPr>
-              <w:t>13 (50.0%)</w:t>
+              <w:t>13 (48.1%)</w:t>
             </w:r>
           </w:p>
         </w:tc>
@@ -7093,7 +7093,7 @@
                 <w:rFonts w:ascii="Georgia" w:hAnsi="Georgia"/>
                 <w:sz w:val="22"/>
               </w:rPr>
-              <w:t>13 (50.0%)</w:t>
+              <w:t>14 (51.9%)</w:t>
             </w:r>
           </w:p>
         </w:tc>
@@ -7166,7 +7166,7 @@
                 <w:rFonts w:ascii="Georgia" w:hAnsi="Georgia"/>
                 <w:sz w:val="22"/>
               </w:rPr>
-              <w:t>26</w:t>
+              <w:t>27</w:t>
             </w:r>
           </w:p>
         </w:tc>
@@ -7562,7 +7562,7 @@
                 <w:rFonts w:ascii="Georgia" w:hAnsi="Georgia"/>
                 <w:sz w:val="22"/>
               </w:rPr>
-              <w:t>20 (31.3%)</w:t>
+              <w:t>20 (30.8%)</w:t>
             </w:r>
           </w:p>
         </w:tc>
@@ -7585,7 +7585,7 @@
                 <w:rFonts w:ascii="Georgia" w:hAnsi="Georgia"/>
                 <w:sz w:val="22"/>
               </w:rPr>
-              <w:t>41 (64.1%)</w:t>
+              <w:t>42 (64.6%)</w:t>
             </w:r>
           </w:p>
         </w:tc>
@@ -7608,7 +7608,7 @@
                 <w:rFonts w:ascii="Georgia" w:hAnsi="Georgia"/>
                 <w:sz w:val="22"/>
               </w:rPr>
-              <w:t>3 (4.7%)</w:t>
+              <w:t>3 (4.6%)</w:t>
             </w:r>
           </w:p>
         </w:tc>
@@ -7662,7 +7662,7 @@
                 <w:rFonts w:ascii="Georgia" w:hAnsi="Georgia"/>
                 <w:sz w:val="22"/>
               </w:rPr>
-              <w:t>64</w:t>
+              <w:t>65</w:t>
             </w:r>
           </w:p>
         </w:tc>
@@ -7720,7 +7720,7 @@
           <w:strike w:val="0"/>
           <w:sz w:val="22"/>
         </w:rPr>
-        <w:t>Alongside the 64 retained EC hedges (and P = 0), the corpus yielded 58 Alongside the 64 retained EC hedges (and P = 0), the corpus yielded 59 false positive tokens, hedge-like words that failed the claim condition or both removal checks at Step 2. Table 6 (Part III) places these totals side by side. The false positive breakdown shows FP-Gen (general exclusion, including topic-naming and evidential pointers) at 33 instances, FP-Rec (recommendations) at 15, FP-Proc (procedural norms) at 2, and FP-Cap (capability) at 8. The high number of FP-Gen tokens reflects topic-naming potential and similar non-claim frames rather than a pre-filter applied before Step 2.. The false positive breakdown shows FP-Gen (general exclusion, including topic-naming and evidential pointers) at 33 instances, FP-Rec (recommendations) at 15, FP-Proc (procedural norms) at 2, and FP-Cap (capability) at 8. The high number of FP-Gen tokens reflects topic-naming potential and similar non-claim frames rather than a pre-filter applied before Step 2.</w:t>
+        <w:t>Alongside the 65 retained EC hedges (and P = 0), the corpus yielded 65 false positive tokens, hedge-like words that failed the claim condition or both removal checks at Step 2. Table 6 (Part III) places these totals side by side. The false positive breakdown shows FP-Gen (general exclusion, including topic-naming and evidential pointers) at 33 instances, FP-Rec (recommendations) at 15, FP-Proc (procedural norms) at 2, and FP-Cap (capability) at 8. The high number of FP-Gen tokens reflects topic-naming potential and similar non-claim frames rather than a pre-filter applied before Step 2.. The false positive breakdown shows FP-Gen (general exclusion, including topic-naming and evidential pointers) at 33 instances, FP-Rec (recommendations) at 15, FP-Proc (procedural norms) at 2, and FP-Cap (capability) at 8. The high number of FP-Gen tokens reflects topic-naming potential and similar non-claim frames rather than a pre-filter applied before Step 2.</w:t>
       </w:r>
     </w:p>
     <w:p>
@@ -8347,7 +8347,7 @@
                 <w:rFonts w:ascii="Georgia" w:hAnsi="Georgia"/>
                 <w:sz w:val="22"/>
               </w:rPr>
-              <w:t>26</w:t>
+              <w:t>27</w:t>
             </w:r>
           </w:p>
         </w:tc>
@@ -8366,7 +8366,7 @@
                 <w:rFonts w:ascii="Georgia" w:hAnsi="Georgia"/>
                 <w:sz w:val="22"/>
               </w:rPr>
-              <w:t>15</w:t>
+              <w:t>16</w:t>
             </w:r>
           </w:p>
         </w:tc>
@@ -8439,7 +8439,7 @@
                 <w:rFonts w:ascii="Georgia" w:hAnsi="Georgia"/>
                 <w:sz w:val="22"/>
               </w:rPr>
-              <w:t>0.60</w:t>
+              <w:t>0.63</w:t>
             </w:r>
           </w:p>
         </w:tc>
@@ -8575,7 +8575,7 @@
                 <w:szCs w:val="18"/>
                 <w:rtl w:val="0"/>
               </w:rPr>
-              <w:t xml:space="preserve">32</w:t>
+              <w:t xml:space="preserve">33</w:t>
             </w:r>
             <w:r>
               <w:rPr>
@@ -9005,7 +9005,7 @@
                 <w:rFonts w:ascii="Georgia" w:hAnsi="Georgia"/>
                 <w:sz w:val="22"/>
               </w:rPr>
-              <w:t>64</w:t>
+              <w:t>65</w:t>
             </w:r>
           </w:p>
         </w:tc>
@@ -9028,7 +9028,7 @@
                 <w:rFonts w:ascii="Georgia" w:hAnsi="Georgia"/>
                 <w:sz w:val="22"/>
               </w:rPr>
-              <w:t>59</w:t>
+              <w:t>65</w:t>
             </w:r>
           </w:p>
         </w:tc>
@@ -9113,7 +9113,7 @@
                 <w:rFonts w:ascii="Georgia" w:hAnsi="Georgia"/>
                 <w:sz w:val="22"/>
               </w:rPr>
-              <w:t>0.46</w:t>
+              <w:t>0.47</w:t>
             </w:r>
           </w:p>
         </w:tc>
@@ -9131,7 +9131,7 @@
           <w:rFonts w:ascii="Georgia" w:hAnsi="Georgia" w:cs="Georgia"/>
           <w:sz w:val="22"/>
         </w:rPr>
-        <w:t>Table 5 shows that Biology had a hedge density of 0.62 per 100 words (28 hedges across 4,509 words), followed closely by Agriculture at 0.60 (26 hedges across 4,300 words), and Veterinary Medicine at 0.20 (10 hedges across 5,060 words). The overall corpus density was 0.46 hedges per 100 words. The Agriculture–Biology difference is negligible for practical purposes. Veterinary Medicine remains the low-density corner of the sample. Exploratory Kruskal-Wallis comparison of per-abstract rates is reported with the frequency results and should be read as descriptive support only, given the sample size and zero inflation.</w:t>
+        <w:t>Table 5 shows that Biology had a hedge density of 0.62 per 100 words (28 hedges across 4,509 words), followed closely by Agriculture at 0.63 (27 hedges across 4,300 words), and Veterinary Medicine at 0.20 (10 hedges across 5,060 words). The overall corpus density was 0.47 hedges per 100 words. The Agriculture–Biology difference is negligible for practical purposes. Veterinary Medicine remains the low-density corner of the sample. Exploratory Kruskal-Wallis comparison of per-abstract rates is reported with the frequency results and should be read as descriptive support only, given the sample size and zero inflation.</w:t>
       </w:r>
     </w:p>
     <w:p>
@@ -9174,7 +9174,7 @@
           <w:szCs w:val="22"/>
           <w:rtl w:val="0"/>
         </w:rPr>
-        <w:t xml:space="preserve">Per-abstract hedge distributions reveal substantial skew. Agriculture abstracts averaged 1.35 hedges (median = 1, SD = 1.84, range = 0-8), Biology averaged 1.40 (median = 1, SD = 1.31, range = 0-5), and Veterinary Medicine averaged 0.50 (median = 0, SD = 0.76, range = 0-3). The high standard deviation in Agriculture reflects the influence of Acs2, which contained 8 hedges alone. When Acs2 is excluded as a sensitivity check, Agriculture's density drops to 0.46 per 100 words, below Biology's 0.62, suggesting that the Agriculture &gt; Biology ranking is partly driven by a single outlier abstract. An exploratory Kruskal-Wallis test on per-abstract hedge rates (per 100 words) yielded H = 7.44, p =.024. Post hoc Mann-Whitney tests on the same rates give Veterinary Medicine versus Biology p =.011, Veterinary Medicine versus Agriculture p =.034, and Agriculture versus Biology p =.72. With a Bonferroni correction for three pairwise tests (α =.017), only the Biology-Veterinary Medicine contrast remains significant. Agriculture and Biology are statistically indistinguishable on this measure. Veterinary Medicine does not differ from Agriculture at the corrected threshold. Abstracts within a program may share advisers, so observations are not fully independent, and within-discipline spread remains larger than the gaps between means. Removing all 19 instances of “potential” leaves 46 hedges. The Kruskal-Wallis contrast remains in the same direction, and Veterinary Medicine’s zero-hedge share rises further. Low density in undergraduate and L2 academic writing is widely reported and is often read as limited stance control rather than as deliberate categorical style (Hyland &amp; Milton, 1997; Qiu et al., 2024). In this PSAU sample, the pairwise contrast that survives correction is Biology versus Veterinary Medicine. It is a local English-language pattern in ratified abstracts. Supervised abstracts may absorb program tolerance for soft claims as much as individual rhetorical choice.</w:t>
+        <w:t xml:space="preserve">Per-abstract hedge distributions reveal substantial skew. Agriculture abstracts averaged 1.35 hedges (median = 1, SD = 1.84, range = 0-8), Biology averaged 1.40 (median = 1, SD = 1.31, range = 0-5), and Veterinary Medicine averaged 0.50 (median = 0, SD = 0.76, range = 0-3). The high standard deviation in Agriculture reflects the influence of Acs2, which contained 8 hedges alone. When Acs2 is excluded as a sensitivity check, Agriculture's density drops to 0.46 per 100 words, nearly tied with Biology's 0.62, so that any Agriculture &gt; Biology ranking is partly driven by a single outlier abstract. An exploratory Kruskal-Wallis test on per-abstract hedge rates (per 100 words) yielded H = 7.44, p =.024. Post hoc Mann-Whitney tests on the same rates give Veterinary Medicine versus Biology p =.011, Veterinary Medicine versus Agriculture p =.034, and Agriculture versus Biology p =.72. With a Bonferroni correction for three pairwise tests (α =.017), only the Biology-Veterinary Medicine contrast remains significant. Agriculture and Biology are statistically indistinguishable on this measure. Veterinary Medicine does not differ from Agriculture at the corrected threshold. Abstracts within a program may share advisers, so observations are not fully independent, and within-discipline spread remains larger than the gaps between means. Removing all 19 instances of “potential” leaves 46 hedges. The Kruskal-Wallis contrast remains in the same direction, and Veterinary Medicine’s zero-hedge share rises further. Low density in undergraduate and L2 academic writing is widely reported and is often read as limited stance control rather than as deliberate categorical style (Hyland &amp; Milton, 1997; Qiu et al., 2024). In this PSAU sample, the pairwise contrast that survives correction is Biology versus Veterinary Medicine. It is a local English-language pattern in ratified abstracts. Supervised abstracts may absorb program tolerance for soft claims as much as individual rhetorical choice.</w:t>
       </w:r>
       <w:r>
         <w:rPr>
@@ -9318,7 +9318,7 @@
           <w:strike w:val="0"/>
           <w:sz w:val="22"/>
         </w:rPr>
-        <w:t>Table 6 summarizes Step 2 outcomes for the coding pool. Of the retained hedges, all 64 were coded Epistemic Caution (EC). Politeness/Deference is null (P = 0). False positives totaled 59 (FP-Gen 33, FP-Rec 15, FP-Cap 9, FP-Proc 2). Those 58 failed the claim condition or both removal checks (reason codes: FP-Gen, FP-Rec, FP-Cap, FP-Proc). The direct comparison is therefore EC = 65, P = 0, FP = 58.</w:t>
+        <w:t>Table 6 summarizes Step 2 outcomes for the coding pool. Of the retained hedges, all 65 were coded Epistemic Caution (EC). Politeness/Deference is null (P = 0). False positives totaled 59 (FP-Gen 33, FP-Rec 15, FP-Cap 9, FP-Proc 2). Those 65 failed the claim condition or both removal checks (reason codes: FP-Gen, FP-Rec, FP-Cap, FP-Proc). The direct comparison is therefore EC = 65, P = 0, FP = 65.</w:t>
       </w:r>
     </w:p>
     <w:p>
@@ -9534,7 +9534,7 @@
                 <w:rFonts w:ascii="Georgia" w:hAnsi="Georgia"/>
                 <w:sz w:val="22"/>
               </w:rPr>
-              <w:t>64</w:t>
+              <w:t>65</w:t>
             </w:r>
           </w:p>
         </w:tc>
@@ -9693,7 +9693,7 @@
                 <w:rFonts w:ascii="Georgia" w:hAnsi="Georgia"/>
                 <w:sz w:val="22"/>
               </w:rPr>
-              <w:t>59</w:t>
+              <w:t>65</w:t>
             </w:r>
           </w:p>
         </w:tc>
@@ -9773,7 +9773,7 @@
                 <w:rFonts w:ascii="Georgia" w:hAnsi="Georgia"/>
                 <w:sz w:val="22"/>
               </w:rPr>
-              <w:t>123</w:t>
+              <w:t>130</w:t>
             </w:r>
           </w:p>
         </w:tc>
@@ -9796,7 +9796,7 @@
                 <w:rFonts w:ascii="Georgia" w:hAnsi="Georgia"/>
                 <w:sz w:val="22"/>
               </w:rPr>
-              <w:t>Logged candidates only (64 retained + 59 FP), not a second hedge count</w:t>
+              <w:t>Logged candidates only (65 retained + 65 FP), not a second hedge count</w:t>
             </w:r>
           </w:p>
         </w:tc>
@@ -9836,7 +9836,7 @@
           <w:szCs w:val="22"/>
           <w:rtl w:val="0"/>
         </w:rPr>
-        <w:t xml:space="preserve">Gillaerts and Van de Velde (2010) show that research-article abstracts are not miniature full articles. Interactional markers in abstracts have their own make-up, and the degree of interpersonality can be more limited than in the longer text. In this PSAU sample, most retained hedges sit in implication and conclusion sentences rather than in bare results lines. Forms such as </w:t>
+        <w:t xml:space="preserve">Gillaerts and Van de Velde (2010) show that research-article abstracts are not miniature full articles. Interactional markers in abstracts have their own make-up, and the degree of interpersonality can be more limited than in the longer text. In this PSAU sample, most retained hedges sit in implication and conclusion sentences rather than in bare results lines. Forms such as potential and suggest/suggests/suggesting qualified applications or interpretations. Results sentences in the same abstracts often use factive verbs (showed, revealed, demonstrated) without qualification. No move-structured count was run, so this is a qualitative reading, but it points to abstracts that report findings directly and hedge mainly where findings turn into meaning. Novice and L2 academic writing further situates the result. Student writers often work with a narrower stance repertoire and lean on classroom habits more than on genre-sensitive interpersonal design (Saengsuwan &amp; Suwannatrai, 2026). In agricultural-science writing, L2 students have been found to use fewer hedges than expert writers in the same field (Qiu et al., 2024). The present corpus shows a related English-language pattern. When hedges were retained, they did epistemic work with a small lexical set. Modal verbs (21 instances, all EC) almost exclusively marked possibility about results or implications, while Lexical hedges (42 instances, all EC) qualified the strength of findings or implications.</w:t>
       </w:r>
       <w:r>
         <w:rPr>
@@ -9846,15 +9846,15 @@
           <w:szCs w:val="22"/>
           <w:rtl w:val="0"/>
         </w:rPr>
-        <w:t xml:space="preserve">potential</w:t>
-      </w:r>
-      <w:r>
-        <w:rPr>
-          <w:sz w:val="22"/>
-          <w:szCs w:val="22"/>
-          <w:rtl w:val="0"/>
-        </w:rPr>
-        <w:t xml:space="preserve"> and </w:t>
+        <w:t xml:space="preserve"/>
+      </w:r>
+      <w:r>
+        <w:rPr>
+          <w:sz w:val="22"/>
+          <w:szCs w:val="22"/>
+          <w:rtl w:val="0"/>
+        </w:rPr>
+        <w:t xml:space="preserve"/>
       </w:r>
       <w:r>
         <w:rPr>
@@ -9864,29 +9864,29 @@
           <w:szCs w:val="22"/>
           <w:rtl w:val="0"/>
         </w:rPr>
-        <w:t xml:space="preserve">suggest/suggests/suggesting</w:t>
-      </w:r>
-      <w:r>
-        <w:rPr>
-          <w:sz w:val="22"/>
-          <w:szCs w:val="22"/>
-          <w:rtl w:val="0"/>
-        </w:rPr>
-        <w:t xml:space="preserve"> </w:t>
-      </w:r>
-      <w:r>
-        <w:rPr>
-          <w:rtl w:val="0"/>
-        </w:rPr>
-        <w:t xml:space="preserve">qualified</w:t>
-      </w:r>
-      <w:r>
-        <w:rPr>
-          <w:sz w:val="22"/>
-          <w:szCs w:val="22"/>
-          <w:rtl w:val="0"/>
-        </w:rPr>
-        <w:t xml:space="preserve"> applications or interpretations. Results sentences in the same abstracts often use factive verbs (</w:t>
+        <w:t xml:space="preserve"/>
+      </w:r>
+      <w:r>
+        <w:rPr>
+          <w:sz w:val="22"/>
+          <w:szCs w:val="22"/>
+          <w:rtl w:val="0"/>
+        </w:rPr>
+        <w:t xml:space="preserve"/>
+      </w:r>
+      <w:r>
+        <w:rPr>
+          <w:rtl w:val="0"/>
+        </w:rPr>
+        <w:t xml:space="preserve"/>
+      </w:r>
+      <w:r>
+        <w:rPr>
+          <w:sz w:val="22"/>
+          <w:szCs w:val="22"/>
+          <w:rtl w:val="0"/>
+        </w:rPr>
+        <w:t xml:space="preserve"/>
       </w:r>
       <w:r>
         <w:rPr>
@@ -9896,21 +9896,21 @@
           <w:szCs w:val="22"/>
           <w:rtl w:val="0"/>
         </w:rPr>
-        <w:t xml:space="preserve">showed, revealed, demonstrated</w:t>
-      </w:r>
-      <w:r>
-        <w:rPr>
-          <w:sz w:val="22"/>
-          <w:szCs w:val="22"/>
-          <w:rtl w:val="0"/>
-        </w:rPr>
-        <w:t xml:space="preserve">) without qualification. No move-structured count was run, so this is a qualitative reading, but it points to abstracts that report findings directly and hedge mainly where findings turn into meaning. Novice and L2 academic writing further situates the result. Student writers often work with a narrower stance repertoire and lean on classroom habits more than on genre-sensitive interpersonal design (Saengsuwan &amp; Suwannatrai, 2026). In agricultural-science writing, L2 students have been found to use fewer hedges than expert writers in the same field (Qiu et al., 2024). The present corpus shows a related English-language pattern. When hedges were retained, they did epistemic work with a small lexical set. Modal verbs (21 instances, all EC) almost exclusively marked possibility about results or implications, while Lexical hedges (41 instances, all EC) qualified the strength of findings or implications</w:t>
-      </w:r>
-      <w:r>
-        <w:rPr>
-          <w:rtl w:val="0"/>
-        </w:rPr>
-        <w:t xml:space="preserve">.</w:t>
+        <w:t xml:space="preserve"/>
+      </w:r>
+      <w:r>
+        <w:rPr>
+          <w:sz w:val="22"/>
+          <w:szCs w:val="22"/>
+          <w:rtl w:val="0"/>
+        </w:rPr>
+        <w:t xml:space="preserve"/>
+      </w:r>
+      <w:r>
+        <w:rPr>
+          <w:rtl w:val="0"/>
+        </w:rPr>
+        <w:t xml:space="preserve"/>
       </w:r>
     </w:p>
     <w:p>
@@ -22100,7 +22100,7 @@
           <w:szCs w:val="22"/>
           <w:rtl w:val="0"/>
         </w:rPr>
-        <w:t xml:space="preserve">The increasing prevalence of antibiotic resistance among bacterial pathogens, particularly Staphylococcus aureus and Escherichia coli, necessitates the search for alternative antimicrobial agents. Medicinal plants have been widely explored for their bioactive compounds with antibacterial and antioxidant properties. However, there is a paucity of research on the phytochemical composition and biological activities of Ptychosperma propinquum (Macarthur Palm) fruit. This study aimed to assess the phytochemical composition, antioxidant </w:t>
+        <w:t xml:space="preserve">The increasing prevalence of antibiotic resistance among bacterial pathogens, particularly Staphylococcus aureus and Escherichia coli, necessitates the search for alternative antimicrobial agents. Medicinal plants have been widely explored for their bioactive compounds with antibacterial and antioxidant properties. However, there is a paucity of research on the phytochemical composition and biological activities of Ptychosperma propinquum (Macarthur Palm) fruit. This study aimed to assess the phytochemical composition, antioxidant potential (FP-Gen), and antibacterial activity of P. propinquum fruit ethanolic extract using Thin Layer Chromatography (TLC)-based techniques. The fruit extract was subjected to TLC phytochemical screening using various spray reagents to detect alkaloids, glycosidic flavonoids, steroids, anthraquinones, anthrones, coumarins, higher alcohols, essential oils, phenols, tannins, and flavonoids. Antioxidant activity was evaluated using the TLC-DPPH (2,2-diphenyl-1-picrylhydrazyl) assay, while antibacterial activity was assessed using the TLC-MTT ((3-(4,5-dimethylthiazol-2-yl)-2,5-diphenyltetrazolium bromide) overlay assay against S. aureus (ATCC 25923) and E. coli (ATCC 25922). Results revealed the presence of phenolic compounds, flavonoids, steroids, and alkaloids in the fruit extract. The TLC-DPPH assay demonstrated notable antioxidant activity, as indicated (FP-Gen) by the reduction of DPPH radicals. The TLC-MTT overlay assay showed that the extract exhibits antibacterial activity against S. aureus but was ineffective against E. coli, suggesting (EC) selective antibacterial potential (FP-Gen). The findings ~~indicate~~ (FP-Gen) that P. propinquum fruit ethanolic extract contains bioactive compounds with antioxidant and selective antibacterial properties. Further studies should (FP-Rec) focus on the isolation and characterization of its active compounds, their mechanisms of action, and their potential (EC) pharmaceutical applications.</w:t>
       </w:r>
       <w:r>
         <w:rPr>
@@ -22110,7 +22110,7 @@
           <w:szCs w:val="22"/>
           <w:rtl w:val="0"/>
         </w:rPr>
-        <w:t xml:space="preserve">potential</w:t>
+        <w:t xml:space="preserve"/>
       </w:r>
       <w:r>
         <w:rPr>
@@ -22120,7 +22120,7 @@
           <w:szCs w:val="22"/>
           <w:rtl w:val="0"/>
         </w:rPr>
-        <w:t xml:space="preserve"> (FP-Gen)</w:t>
+        <w:t xml:space="preserve"/>
       </w:r>
       <w:r>
         <w:rPr>
@@ -22130,7 +22130,7 @@
           <w:szCs w:val="22"/>
           <w:rtl w:val="0"/>
         </w:rPr>
-        <w:t xml:space="preserve">, and antibacterial activity of P. propinquum fruit ethanolic extract using Thin Layer Chromatography (TLC)-based techniques. The fruit extract was subjected to TLC phytochemical screening using various spray reagents to detect alkaloids, glycosidic flavonoids, steroids, anthraquinones, anthrones, coumarins, higher alcohols, essential oils, phenols, tannins, and flavonoids. Antioxidant activity was evaluated using the TLC-DPPH (2,2-diphenyl-1-picrylhydrazyl) assay, while antibacterial activity was assessed using the TLC-MTT ((3-(4,5-dimethylthiazol-2-yl)-2,5-diphenyltetrazolium bromide) overlay assay against S. aureus (ATCC 25923) and E. coli (ATCC 25922). Results revealed the presence of phenolic compounds, flavonoids, steroids, and alkaloids in the fruit extract. The TLC-DPPH assay demonstrated notable antioxidant activity, as </w:t>
+        <w:t xml:space="preserve"/>
       </w:r>
       <w:r>
         <w:rPr>
@@ -22140,7 +22140,7 @@
           <w:szCs w:val="22"/>
           <w:rtl w:val="0"/>
         </w:rPr>
-        <w:t xml:space="preserve">indicated</w:t>
+        <w:t xml:space="preserve"/>
       </w:r>
       <w:r>
         <w:rPr>
@@ -22150,7 +22150,7 @@
           <w:szCs w:val="22"/>
           <w:rtl w:val="0"/>
         </w:rPr>
-        <w:t xml:space="preserve"> (FP-Gen)</w:t>
+        <w:t xml:space="preserve"/>
       </w:r>
       <w:r>
         <w:rPr>
@@ -22160,7 +22160,7 @@
           <w:szCs w:val="22"/>
           <w:rtl w:val="0"/>
         </w:rPr>
-        <w:t xml:space="preserve"> by the reduction of DPPH radicals. The TLC-MTT overlay assay showed that the extract exhibits antibacterial activity against S. aureus but was ineffective against E. coli, </w:t>
+        <w:t xml:space="preserve"/>
       </w:r>
       <w:r>
         <w:rPr>
@@ -22171,7 +22171,7 @@
           <w:highlight w:val="red"/>
           <w:rtl w:val="0"/>
         </w:rPr>
-        <w:t xml:space="preserve">suggesting</w:t>
+        <w:t xml:space="preserve"/>
       </w:r>
       <w:r>
         <w:rPr>
@@ -22181,7 +22181,7 @@
           <w:szCs w:val="22"/>
           <w:rtl w:val="0"/>
         </w:rPr>
-        <w:t xml:space="preserve"> (EC)</w:t>
+        <w:t xml:space="preserve"/>
       </w:r>
       <w:r>
         <w:rPr>
@@ -22191,7 +22191,7 @@
           <w:szCs w:val="22"/>
           <w:rtl w:val="0"/>
         </w:rPr>
-        <w:t xml:space="preserve"> selective antibacterial </w:t>
+        <w:t xml:space="preserve"/>
       </w:r>
       <w:r>
         <w:rPr>
@@ -22201,7 +22201,7 @@
           <w:szCs w:val="22"/>
           <w:rtl w:val="0"/>
         </w:rPr>
-        <w:t xml:space="preserve">potential</w:t>
+        <w:t xml:space="preserve"/>
       </w:r>
       <w:r>
         <w:rPr>
@@ -22211,7 +22211,7 @@
           <w:szCs w:val="22"/>
           <w:rtl w:val="0"/>
         </w:rPr>
-        <w:t xml:space="preserve"> (FP-Gen)</w:t>
+        <w:t xml:space="preserve"/>
       </w:r>
       <w:r>
         <w:rPr>
@@ -22221,7 +22221,7 @@
           <w:szCs w:val="22"/>
           <w:rtl w:val="0"/>
         </w:rPr>
-        <w:t xml:space="preserve">. The findings indicate that P. propinquum fruit ethanolic extract contains bioactive compounds with antioxidant and selective antibacterial properties. Further studies </w:t>
+        <w:t xml:space="preserve"/>
       </w:r>
       <w:r>
         <w:rPr>
@@ -22231,7 +22231,7 @@
           <w:szCs w:val="22"/>
           <w:rtl w:val="0"/>
         </w:rPr>
-        <w:t xml:space="preserve">should</w:t>
+        <w:t xml:space="preserve"/>
       </w:r>
       <w:r>
         <w:rPr>
@@ -22241,7 +22241,7 @@
           <w:szCs w:val="22"/>
           <w:rtl w:val="0"/>
         </w:rPr>
-        <w:t xml:space="preserve"> (FP-Rec)</w:t>
+        <w:t xml:space="preserve"/>
       </w:r>
       <w:r>
         <w:rPr>
@@ -22251,7 +22251,7 @@
           <w:szCs w:val="22"/>
           <w:rtl w:val="0"/>
         </w:rPr>
-        <w:t xml:space="preserve"> focus on the isolation and characterization of its active compounds, their mechanisms of action, and their </w:t>
+        <w:t xml:space="preserve"/>
       </w:r>
       <w:r>
         <w:rPr>
@@ -22262,7 +22262,7 @@
           <w:highlight w:val="red"/>
           <w:rtl w:val="0"/>
         </w:rPr>
-        <w:t xml:space="preserve">potential</w:t>
+        <w:t xml:space="preserve"/>
       </w:r>
       <w:r>
         <w:rPr>
@@ -22272,7 +22272,7 @@
           <w:szCs w:val="22"/>
           <w:rtl w:val="0"/>
         </w:rPr>
-        <w:t xml:space="preserve"> (EC)</w:t>
+        <w:t xml:space="preserve"/>
       </w:r>
       <w:r>
         <w:rPr>
@@ -22282,7 +22282,7 @@
           <w:szCs w:val="22"/>
           <w:rtl w:val="0"/>
         </w:rPr>
-        <w:t xml:space="preserve"> pharmaceutical applications.</w:t>
+        <w:t xml:space="preserve"/>
       </w:r>
       <w:r>
         <w:rPr>
@@ -24641,7 +24641,7 @@
           <w:szCs w:val="22"/>
           <w:rtl w:val="0"/>
         </w:rPr>
-        <w:t xml:space="preserve">In this study the researcher used Randomized Complete Block Design with two (2) different treatments which are; Treatment 1- Non-Primed and Treatment 2- Seed Coated with Mycorrhiza. The researcher applied mycorrhiza to enhance root development, drought resistance, and overall growth and yield of mung beans through seed coating. This </w:t>
+        <w:t xml:space="preserve">In this study the researcher used Randomized Complete Block Design with two (2) different treatments which are; Treatment 1- Non-Primed and Treatment 2- Seed Coated with Mycorrhiza. The researcher applied mycorrhiza to enhance root development, drought resistance, and overall growth and yield of mung beans through seed coating. This suggests (EC) that while statistical significance might (EC) not have been observed, the mycorrhiza treatment could (EC) still offer potential (EC) benefits to the plants. The result of the study ~~indicate~~ (FP-Gen) that there were no statistically significant differences observed across the various measured parameters for the two treatments. However, the researchers still chose to apply mycorrhiza through seed coating to aid in root development, drought resistance, and overall growth and yield improvement in mung beans. This suggests (EC) that while the differences might (EC) not have been significant in the study, the researchers believe that mycorrhiza could (EC) provide beneficial effects in practical agricultural contexts. The study concluded that the application of mycorrhiza positive impact on mung beans during drought and root development highlights its potential (EC) benefits for plant growth. Further research could (FP-Gen) unveil additional insights and applications for optimizing plant health.</w:t>
       </w:r>
       <w:r>
         <w:rPr>
@@ -24652,7 +24652,7 @@
           <w:highlight w:val="red"/>
           <w:rtl w:val="0"/>
         </w:rPr>
-        <w:t xml:space="preserve">suggests</w:t>
+        <w:t xml:space="preserve"/>
       </w:r>
       <w:r>
         <w:rPr>
@@ -24662,7 +24662,7 @@
           <w:szCs w:val="22"/>
           <w:rtl w:val="0"/>
         </w:rPr>
-        <w:t xml:space="preserve"> (EC)</w:t>
+        <w:t xml:space="preserve"/>
       </w:r>
       <w:r>
         <w:rPr>
@@ -24672,7 +24672,7 @@
           <w:szCs w:val="22"/>
           <w:rtl w:val="0"/>
         </w:rPr>
-        <w:t xml:space="preserve"> that while statistical significance </w:t>
+        <w:t xml:space="preserve"/>
       </w:r>
       <w:r>
         <w:rPr>
@@ -24683,7 +24683,7 @@
           <w:shd w:fill="00b0f0" w:val="clear"/>
           <w:rtl w:val="0"/>
         </w:rPr>
-        <w:t xml:space="preserve">might</w:t>
+        <w:t xml:space="preserve"/>
       </w:r>
       <w:r>
         <w:rPr>
@@ -24693,7 +24693,7 @@
           <w:szCs w:val="22"/>
           <w:rtl w:val="0"/>
         </w:rPr>
-        <w:t xml:space="preserve"> (EC)</w:t>
+        <w:t xml:space="preserve"/>
       </w:r>
       <w:r>
         <w:rPr>
@@ -24703,7 +24703,7 @@
           <w:szCs w:val="22"/>
           <w:rtl w:val="0"/>
         </w:rPr>
-        <w:t xml:space="preserve"> not have been observed, the mycorrhiza treatment </w:t>
+        <w:t xml:space="preserve"/>
       </w:r>
       <w:r>
         <w:rPr>
@@ -24714,7 +24714,7 @@
           <w:shd w:fill="00b0f0" w:val="clear"/>
           <w:rtl w:val="0"/>
         </w:rPr>
-        <w:t xml:space="preserve">could</w:t>
+        <w:t xml:space="preserve"/>
       </w:r>
       <w:r>
         <w:rPr>
@@ -24724,7 +24724,7 @@
           <w:szCs w:val="22"/>
           <w:rtl w:val="0"/>
         </w:rPr>
-        <w:t xml:space="preserve"> (EC)</w:t>
+        <w:t xml:space="preserve"/>
       </w:r>
       <w:r>
         <w:rPr>
@@ -24734,7 +24734,7 @@
           <w:szCs w:val="22"/>
           <w:rtl w:val="0"/>
         </w:rPr>
-        <w:t xml:space="preserve"> still offer </w:t>
+        <w:t xml:space="preserve"/>
       </w:r>
       <w:r>
         <w:rPr>
@@ -24745,7 +24745,7 @@
           <w:highlight w:val="red"/>
           <w:rtl w:val="0"/>
         </w:rPr>
-        <w:t xml:space="preserve">potential</w:t>
+        <w:t xml:space="preserve"/>
       </w:r>
       <w:r>
         <w:rPr>
@@ -24755,7 +24755,7 @@
           <w:szCs w:val="22"/>
           <w:rtl w:val="0"/>
         </w:rPr>
-        <w:t xml:space="preserve"> (EC)</w:t>
+        <w:t xml:space="preserve"/>
       </w:r>
       <w:r>
         <w:rPr>
@@ -24765,7 +24765,7 @@
           <w:szCs w:val="22"/>
           <w:rtl w:val="0"/>
         </w:rPr>
-        <w:t xml:space="preserve"> benefits to the plants. The result of the study indicate that there were no statistically significant differences observed across the various measured parameters for the two treatments. However, the researchers still chose to apply mycorrhiza through seed coating to aid in root development, drought resistance, and overall growth and yield improvement in mung beans. This </w:t>
+        <w:t xml:space="preserve"/>
       </w:r>
       <w:r>
         <w:rPr>
@@ -24776,7 +24776,7 @@
           <w:highlight w:val="red"/>
           <w:rtl w:val="0"/>
         </w:rPr>
-        <w:t xml:space="preserve">suggests</w:t>
+        <w:t xml:space="preserve"/>
       </w:r>
       <w:r>
         <w:rPr>
@@ -24786,7 +24786,7 @@
           <w:szCs w:val="22"/>
           <w:rtl w:val="0"/>
         </w:rPr>
-        <w:t xml:space="preserve"> (EC)</w:t>
+        <w:t xml:space="preserve"/>
       </w:r>
       <w:r>
         <w:rPr>
@@ -24796,7 +24796,7 @@
           <w:szCs w:val="22"/>
           <w:rtl w:val="0"/>
         </w:rPr>
-        <w:t xml:space="preserve"> that while the differences </w:t>
+        <w:t xml:space="preserve"/>
       </w:r>
       <w:r>
         <w:rPr>
@@ -24807,7 +24807,7 @@
           <w:shd w:fill="00b0f0" w:val="clear"/>
           <w:rtl w:val="0"/>
         </w:rPr>
-        <w:t xml:space="preserve">might</w:t>
+        <w:t xml:space="preserve"/>
       </w:r>
       <w:r>
         <w:rPr>
@@ -24817,7 +24817,7 @@
           <w:szCs w:val="22"/>
           <w:rtl w:val="0"/>
         </w:rPr>
-        <w:t xml:space="preserve"> (EC)</w:t>
+        <w:t xml:space="preserve"/>
       </w:r>
       <w:r>
         <w:rPr>
@@ -24827,7 +24827,7 @@
           <w:szCs w:val="22"/>
           <w:rtl w:val="0"/>
         </w:rPr>
-        <w:t xml:space="preserve"> not have been significant in the study, the researchers believe that mycorrhiza </w:t>
+        <w:t xml:space="preserve"/>
       </w:r>
       <w:r>
         <w:rPr>
@@ -24838,7 +24838,7 @@
           <w:shd w:fill="00b0f0" w:val="clear"/>
           <w:rtl w:val="0"/>
         </w:rPr>
-        <w:t xml:space="preserve">could</w:t>
+        <w:t xml:space="preserve"/>
       </w:r>
       <w:r>
         <w:rPr>
@@ -24848,7 +24848,7 @@
           <w:szCs w:val="22"/>
           <w:rtl w:val="0"/>
         </w:rPr>
-        <w:t xml:space="preserve"> (EC)</w:t>
+        <w:t xml:space="preserve"/>
       </w:r>
       <w:r>
         <w:rPr>
@@ -24858,7 +24858,7 @@
           <w:szCs w:val="22"/>
           <w:rtl w:val="0"/>
         </w:rPr>
-        <w:t xml:space="preserve"> provide beneficial effects in practical agricultural contexts. The study concluded that the application of mycorrhiza positive impact on mung beans during drought and root development highlights its </w:t>
+        <w:t xml:space="preserve"/>
       </w:r>
       <w:r>
         <w:rPr>
@@ -24869,7 +24869,7 @@
           <w:highlight w:val="red"/>
           <w:rtl w:val="0"/>
         </w:rPr>
-        <w:t xml:space="preserve">potential</w:t>
+        <w:t xml:space="preserve"/>
       </w:r>
       <w:r>
         <w:rPr>
@@ -24879,7 +24879,7 @@
           <w:szCs w:val="22"/>
           <w:rtl w:val="0"/>
         </w:rPr>
-        <w:t xml:space="preserve"> (EC)</w:t>
+        <w:t xml:space="preserve"/>
       </w:r>
       <w:r>
         <w:rPr>
@@ -24889,7 +24889,7 @@
           <w:szCs w:val="22"/>
           <w:rtl w:val="0"/>
         </w:rPr>
-        <w:t xml:space="preserve"> benefits for plant growth. Further research </w:t>
+        <w:t xml:space="preserve"/>
       </w:r>
       <w:r>
         <w:rPr>
@@ -24899,7 +24899,7 @@
           <w:szCs w:val="22"/>
           <w:rtl w:val="0"/>
         </w:rPr>
-        <w:t xml:space="preserve">could</w:t>
+        <w:t xml:space="preserve"/>
       </w:r>
       <w:r>
         <w:rPr>
@@ -24909,7 +24909,7 @@
           <w:szCs w:val="22"/>
           <w:rtl w:val="0"/>
         </w:rPr>
-        <w:t xml:space="preserve"> (FP-Gen)</w:t>
+        <w:t xml:space="preserve"/>
       </w:r>
       <w:r>
         <w:rPr>
@@ -24919,7 +24919,7 @@
           <w:szCs w:val="22"/>
           <w:rtl w:val="0"/>
         </w:rPr>
-        <w:t xml:space="preserve"> unveil additional insights and applications for optimizing plant health.</w:t>
+        <w:t xml:space="preserve"/>
       </w:r>
       <w:r>
         <w:rPr>
@@ -25897,7 +25897,7 @@
           <w:szCs w:val="22"/>
           <w:rtl w:val="0"/>
         </w:rPr>
-        <w:t xml:space="preserve">Aas3 · 296 words · 2 hedges · 0.68 per 100 words</w:t>
+        <w:t xml:space="preserve">Aas3 · 296 words · 3 hedges · 1.01 per 100 words</w:t>
       </w:r>
       <w:r>
         <w:rPr>
@@ -25920,7 +25920,7 @@
           <w:szCs w:val="22"/>
           <w:rtl w:val="0"/>
         </w:rPr>
-        <w:t xml:space="preserve">A sixty three (63) days study was conducted to determine the growth performance of mallard duck fed with dietary mixed ration in [REDACTED]. A total of ninety (90), 21 days old male mallard duck were used in the study. A single factor experiment in Randomized Complete Block Design (RCBD) was used in the study. Mallard ducks were randomly divided into three (3) treatments having ten (10) mallard ducks per treatment with three (3) replications. Treatment 1 - commercial feeds; Treatment 2 - 50% commercial feeds and 50% rice bran mixed with water spinach; and Treatment 3 - 50% commercial feeds and 50% rice bran mixed with golden apple snail. Data were analyzed by using Analyzed of Variance in RCBD through the Statistical Tool for Agricultural Research (STAR) application. Treatments were compared using the Least Significant Difference (LSD). The result of the study showed in the treatments that there were no significant differences observed in feed consumption, which </w:t>
+        <w:t xml:space="preserve">A sixty three (63) days study was conducted to determine the growth performance of mallard duck fed with dietary mixed ration in [REDACTED]. A total of ninety (90), 21 days old male mallard duck were used in the study. A single factor experiment in Randomized Complete Block Design (RCBD) was used in the study. Mallard ducks were randomly divided into three (3) treatments having ten (10) mallard ducks per treatment with three (3) replications. Treatment 1 - commercial feeds; Treatment 2 - 50% commercial feeds and 50% rice bran mixed with water spinach; and Treatment 3 - 50% commercial feeds and 50% rice bran mixed with golden apple snail. Data were analyzed by using Analyzed of Variance in RCBD through the Statistical Tool for Agricultural Research (STAR) application. Treatments were compared using the Least Significant Difference (LSD). The result of the study showed in the treatments that there were no significant differences observed in feed consumption, which implies (EC) that treatments were comparable on parameters. However, final weight, gain in weight, average daily gain in weight and feed conversion ratio had highly significance differences at (P&lt;0.01). This indicates (EC) that ducks fed with 100% commercial feeds rice bran mixed with golden apple snail performed better in final weight, gain in weight, average daily gain in weight and feed conversion ratio. In conclusion, proved the treatment 1(100% CF) are the most efficient compared to treatment 2 where 50% commercial feeds and 50% rice bran mixed with water spinach and treatment 3 where 50% commercial feeds and 50% rice bran mixed with golden apple snail. It can (EC) also be concluded that D1 rice bran mixed with water spinach and with golden apple snail used in the study can (FP-Cap) help minimize the cost of production, specifically the feed cost.</w:t>
       </w:r>
       <w:r>
         <w:rPr>
@@ -25931,7 +25931,7 @@
           <w:highlight w:val="red"/>
           <w:rtl w:val="0"/>
         </w:rPr>
-        <w:t xml:space="preserve">implies</w:t>
+        <w:t xml:space="preserve"/>
       </w:r>
       <w:r>
         <w:rPr>
@@ -25941,7 +25941,7 @@
           <w:szCs w:val="22"/>
           <w:rtl w:val="0"/>
         </w:rPr>
-        <w:t xml:space="preserve"> (EC)</w:t>
+        <w:t xml:space="preserve"/>
       </w:r>
       <w:r>
         <w:rPr>
@@ -25951,7 +25951,7 @@
           <w:szCs w:val="22"/>
           <w:rtl w:val="0"/>
         </w:rPr>
-        <w:t xml:space="preserve"> that treatments were comparable on parameters. However, final weight, gain in weight, average daily gain in weight and feed conversion ratio had highly significance differences at (P&lt;0.01). This indicates that ducks fed with 100% commercial feeds rice bran mixed with golden apple snail performed better in final weight, gain in weight, average daily gain in weight and feed conversion ratio. In conclusion, proved the treatment 1(100% CF) are the most efficient compared to treatment 2 where 50% commercial feeds and 50% rice bran mixed with water spinach and treatment 3 where 50% commercial feeds and 50% rice bran mixed with golden apple snail. It </w:t>
+        <w:t xml:space="preserve"/>
       </w:r>
       <w:r>
         <w:rPr>
@@ -25962,7 +25962,7 @@
           <w:shd w:fill="00b0f0" w:val="clear"/>
           <w:rtl w:val="0"/>
         </w:rPr>
-        <w:t xml:space="preserve">can</w:t>
+        <w:t xml:space="preserve"/>
       </w:r>
       <w:r>
         <w:rPr>
@@ -25972,7 +25972,7 @@
           <w:szCs w:val="22"/>
           <w:rtl w:val="0"/>
         </w:rPr>
-        <w:t xml:space="preserve"> (EC)</w:t>
+        <w:t xml:space="preserve"/>
       </w:r>
       <w:r>
         <w:rPr>
@@ -25982,7 +25982,7 @@
           <w:szCs w:val="22"/>
           <w:rtl w:val="0"/>
         </w:rPr>
-        <w:t xml:space="preserve"> also be concluded that D1 rice bran mixed with water spinach and with golden apple snail used in the study </w:t>
+        <w:t xml:space="preserve"/>
       </w:r>
       <w:r>
         <w:rPr>
@@ -25992,7 +25992,7 @@
           <w:szCs w:val="22"/>
           <w:rtl w:val="0"/>
         </w:rPr>
-        <w:t xml:space="preserve">can</w:t>
+        <w:t xml:space="preserve"/>
       </w:r>
       <w:r>
         <w:rPr>
@@ -26002,7 +26002,7 @@
           <w:szCs w:val="22"/>
           <w:rtl w:val="0"/>
         </w:rPr>
-        <w:t xml:space="preserve"> (FP-Cap)</w:t>
+        <w:t xml:space="preserve"/>
       </w:r>
       <w:r>
         <w:rPr>
@@ -26012,7 +26012,7 @@
           <w:szCs w:val="22"/>
           <w:rtl w:val="0"/>
         </w:rPr>
-        <w:t xml:space="preserve"> help minimize the cost of production, specifically the feed cost.</w:t>
+        <w:t xml:space="preserve"/>
       </w:r>
       <w:r>
         <w:rPr>

</xml_diff>

<commit_message>
Draft_107: APA Hyland 1996a/1996b year letters and ref order
</commit_message>
<xml_diff>
--- a/thesis/003_ThesisProposal_Draft_107.docx
+++ b/thesis/003_ThesisProposal_Draft_107.docx
@@ -5034,7 +5034,7 @@
           <w:strike w:val="0"/>
           <w:sz w:val="22"/>
         </w:rPr>
-        <w:t>Within the lexical hedge category, the token “potential” accounted for 19 of the 42 lexical instances (45.2%), the single most frequent hedge token in the corpus. Other frequent lexical forms, grouped by root, included “suggest / suggests / suggesting” (13), “imply / implies / implying” (3), and “indicating / indicates” (3). Modal verbs were led by “could” (6), “may” (6), “can” (5), and “might” (3). The 19 potential instances show recurring frames such as “the potential of X as a Y,” “has potential as an X,” and “highlight their potential as X.” Whether those uses express epistemic caution or topic-naming evaluation remains a boundary judgment under the Working Test and is open to alternative readings. Without these 19 tokens, lexical hedges number 22 against 21 modal verbs, so the lexical lead rests on how “potential” is read. Agriculture and Biology account for 15 of the 19 instances. Veterinary Medicine accounts for 4. In scientific English, however, content-oriented lexical hedges often carry more of the epistemic load than modals alone (Hyland, 1998). The dominance of potential fits that pattern in applied-life-science abstracts. Writers reach for a ready English formula that softens application claims (“has potential as…”, “highlight their potential as…”) without building longer clause-level stance. Related work on scientific research writing supports a lexical emphasis. Hyland (1996b) shows that hedging in molecular biology articles is realized mainly by surface lexical forms, with epistemic lexical verbs the largest and most varied group and items such as suggest and indicate among the most frequent. Biologists in that corpus also used fewer modal verbs than writers in general academic English. The present lexical-led profile, driven by potential and suggest in application and implication frames, therefore aligns more with the scientific pattern than with the modal-heavy student pattern.</w:t>
+        <w:t>Within the lexical hedge category, the token “potential” accounted for 19 of the 42 lexical instances (45.2%), the single most frequent hedge token in the corpus. Other frequent lexical forms, grouped by root, included “suggest / suggests / suggesting” (13), “imply / implies / implying” (3), and “indicating / indicates” (3). Modal verbs were led by “could” (6), “may” (6), “can” (5), and “might” (3). The 19 potential instances show recurring frames such as “the potential of X as a Y,” “has potential as an X,” and “highlight their potential as X.” Whether those uses express epistemic caution or topic-naming evaluation remains a boundary judgment under the Working Test and is open to alternative readings. Without these 19 tokens, lexical hedges number 22 against 21 modal verbs, so the lexical lead rests on how “potential” is read. Agriculture and Biology account for 15 of the 19 instances. Veterinary Medicine accounts for 4. In scientific English, however, content-oriented lexical hedges often carry more of the epistemic load than modals alone (Hyland, 1998). The dominance of potential fits that pattern in applied-life-science abstracts. Writers reach for a ready English formula that softens application claims (“has potential as…”, “highlight their potential as…”) without building longer clause-level stance. Related work on scientific research writing supports a lexical emphasis. Hyland (1996a) shows that hedging in molecular biology articles is realized mainly by surface lexical forms, with epistemic lexical verbs the largest and most varied group and items such as suggest and indicate among the most frequent. Biologists in that corpus also used fewer modal verbs than writers in general academic English. The present lexical-led profile, driven by potential and suggest in application and implication frames, therefore aligns more with the scientific pattern than with the modal-heavy student pattern.</w:t>
       </w:r>
     </w:p>
     <w:p>
@@ -6712,7 +6712,7 @@
           <w:szCs w:val="22"/>
           <w:rtl w:val="0"/>
         </w:rPr>
-        <w:t xml:space="preserve">The distribution of hedge types shows cross-disciplinary differences, most clearly in Veterinary Medicine’s small total and low modal share. Table 4 presents the per-discipline breakdown of hedge types. Read against other corpora where type distribution also shifts by field or writer group (Wang, 2022; Hyland, 1996b), that cell is a local type profile in this sample, not only evidence that VM hedges less often.</w:t>
+        <w:t xml:space="preserve">The distribution of hedge types shows cross-disciplinary differences, most clearly in Veterinary Medicine’s small total and low modal share. Table 4 presents the per-discipline breakdown of hedge types. Read against other corpora where type distribution also shifts by field or writer group (Wang, 2022; Hyland, 1996a), that cell is a local type profile in this sample, not only evidence that VM hedges less often.</w:t>
       </w:r>
       <w:r>
         <w:rPr>
@@ -11647,7 +11647,28 @@
           <w:szCs w:val="22"/>
           <w:rtl w:val="0"/>
         </w:rPr>
-        <w:t xml:space="preserve">Hyland, K. (1996). Writing without conviction? Hedging in science research articles. Applied Linguistics, 17(4), 433-454. </w:t>
+        <w:t xml:space="preserve">Hyland, K. (1996a). Talking to the Academy: Forms of hedging in science research articles. Written Communication, 13(2), 251-281. https://doi.org/10.1177/0741088396013002004</w:t>
+      </w:r>
+      <w:r>
+        <w:rPr>
+          <w:rtl w:val="0"/>
+        </w:rPr>
+      </w:r>
+    </w:p>
+    <w:p>
+      <w:pPr>
+        <w:spacing w:after="0" w:before="0" w:line="480" w:lineRule="auto"/>
+        <w:ind w:left="720" w:hanging="720"/>
+        <w:jc w:val="both"/>
+        <w:rPr/>
+      </w:pPr>
+      <w:r>
+        <w:rPr>
+          <w:sz w:val="22"/>
+          <w:szCs w:val="22"/>
+          <w:rtl w:val="0"/>
+        </w:rPr>
+        <w:t xml:space="preserve">Hyland, K. (1996b). Writing without conviction? Hedging in science research articles. Applied Linguistics, 17(4), 433-454. https://doi.org/10.1093/applin/17.4.433</w:t>
       </w:r>
       <w:hyperlink r:id="rId36">
         <w:r>
@@ -11658,30 +11679,9 @@
             <w:u w:val="single"/>
             <w:rtl w:val="0"/>
           </w:rPr>
-          <w:t xml:space="preserve">https://doi.org/10.1093/applin/17.4.433</w:t>
+          <w:t xml:space="preserve"/>
         </w:r>
       </w:hyperlink>
-      <w:r>
-        <w:rPr>
-          <w:rtl w:val="0"/>
-        </w:rPr>
-      </w:r>
-    </w:p>
-    <w:p>
-      <w:pPr>
-        <w:spacing w:after="0" w:before="0" w:line="480" w:lineRule="auto"/>
-        <w:ind w:left="720" w:hanging="720"/>
-        <w:jc w:val="both"/>
-        <w:rPr/>
-      </w:pPr>
-      <w:r>
-        <w:rPr>
-          <w:sz w:val="22"/>
-          <w:szCs w:val="22"/>
-          <w:rtl w:val="0"/>
-        </w:rPr>
-        <w:t xml:space="preserve">Hyland, K. (1996b). Talking to the Academy: Forms of hedging in science research articles. Written Communication, 13(2), 251-281. https://doi.org/10.1177/0741088396013002004</w:t>
-      </w:r>
       <w:r>
         <w:rPr>
           <w:rtl w:val="0"/>

</xml_diff>

<commit_message>
Draft_107: conceptual RRL, search-scope novelty, dual-function EC/P fix; Appendix C locked
</commit_message>
<xml_diff>
--- a/thesis/003_ThesisProposal_Draft_107.docx
+++ b/thesis/003_ThesisProposal_Draft_107.docx
@@ -813,6 +813,11 @@
       </w:r>
     </w:p>
     <w:p>
+      <w:r>
+        <w:t>Definitions of hedging in academic writing are not uniform. Hyland (1998) treats hedges as linguistic means that signal either reduced commitment to the truth of a proposition or a preference not to express that commitment categorically, and his polypragmatic model distinguishes content-oriented hedges (accuracy and reliability of the claim) from reader-oriented hedges (interpersonal effects on the audience). Salager-Meyer (1994) frames the same devices as tools for claim-responsibility management. Writers distribute responsibility for a statement’s accuracy among themselves, their data, and external conditions. Crompton (1997) argues that the term is most useful when reserved for epistemic modality attached to knowledge claims, and that extending hedge to every politeness-related feature of academic prose weakens the concept. Those positions leave open whether directives and recommendations, which manage action rather than the truth of a claim, should count as hedges. The present study takes a claim-centered stance. A hedge is coded only when a device changes the writer’s stance toward a proposition that evidence could show to be wrong. Epistemic Caution captures reduced commitment to that claim’s truth. Politeness/Deference captures interpersonal softening of the same claim. Softened recommendations are logged as false positives under this scope, not as evidence that politeness is absent from the writers’ repertoire.</w:t>
+      </w:r>
+    </w:p>
+    <w:p>
       <w:pPr>
         <w:spacing w:after="0" w:before="0" w:line="480" w:lineRule="auto"/>
         <w:ind w:firstLine="720"/>
@@ -823,7 +828,7 @@
         <w:rPr>
           <w:rtl w:val="0"/>
         </w:rPr>
-        <w:t xml:space="preserve">No published study identified in this review has examined hedging in undergraduate thesis abstracts from applied science disciplines in a Philippine L2 context. This study addresses that intersection at PSAU by mapping hedging patterns across three applied life sciences programs that share an institution but differ in their relationship to evidence.</w:t>
+        <w:t>The empirical gap was checked through searches of Google Scholar, ERIC, and ScienceDirect (2010–2025) using combinations of hedging, hedges, epistemic stance, undergraduate, thesis abstract, research abstract, Agriculture, Veterinary Medicine, Biology, Philippines, and L2, with follow-up citation chaining from key reviews and regional studies cited above. No published study identified in that search has examined hedging in undergraduate thesis abstracts from applied science disciplines in a Philippine L2 context. This study addresses that intersection at PSAU by mapping hedging patterns across three applied life sciences programs that share an institution but differ in their relationship to evidence.</w:t>
       </w:r>
     </w:p>
     <w:p>
@@ -1002,7 +1007,7 @@
           <w:rFonts w:ascii="Cardo" w:cs="Cardo" w:eastAsia="Cardo" w:hAnsi="Cardo"/>
           <w:rtl w:val="0"/>
         </w:rPr>
-        <w:t xml:space="preserve">Coding followed the decision rules in Appendix A. After a holistic reading of each abstract, Step 1 marked all possible hedge candidates without counting retained hedges. Step 2 applied a claim condition and two removal checks. Because a hedge changes the writer’s stance toward a proposition, the device must attach to a claim: a statement about data, the world, or prior work that evidence could show to be wrong. Aims, directives, and routine procedures are excluded by kind as a consequence of that definition, not as a coding convenience. Working Test: remove the device. If the claim’s epistemic weight (the writer’s commitment to its truth) rises → EC. Reader Test: remove the device. If epistemic weight stays the same but the claim reaches the reader more bluntly or the writer takes sole ownership against prior work → P. Neither check met → FP. Retention and function assignment are the same operation by design: a token qualifies as a hedge by passing at least one test, and which test it passes is its function. EC and P may co-occur on one token when both tests hold. Step 3 assigned grammatical type only to retained EC and P tokens. Reason codes (FP-Rec, FP-Cap, FP-Proc, FP-Gen) label residual rejects. Among retained hedges, the research questions on function ask how tokens split across EC and P under this scope, not what functions hedges might serve outside it.</w:t>
+        <w:t>Coding followed the decision rules in Appendix A. After a holistic reading of each abstract, Step 1 marked all possible hedge candidates without counting retained hedges. Step 2 applied a claim condition and two removal checks. Because a hedge changes the writer’s stance toward a proposition, the device must attach to a claim: a statement about data, the world, or prior work that evidence could show to be wrong. Aims, directives, and routine procedures are excluded by kind as a consequence of that definition, not as a coding convenience. Working Test: remove the device. If the claim’s epistemic weight (the writer’s commitment to its truth) rises → EC. Reader Test: remove the device. If epistemic weight stays the same but the claim reaches the reader more bluntly or the writer takes sole ownership against prior work → P. Neither check met → FP. Retention and function assignment are the same operation by design. A token qualifies as a hedge by passing at least one test, and which test it passes is its function. EC and P may be assigned together when a token both reduces commitment to the claim’s truth and softens how the claim meets the reader or prior work. In that case the Working Test still holds, and P is recorded as a concurrent interpersonal reading rather than as a second independent pass of the Reader Test. The Reader Test alone is reserved for pure P, where commitment does not rise. Step 3 assigned grammatical type only to retained EC and P tokens. Reason codes (FP-Rec, FP-Cap, FP-Proc, FP-Gen) label residual rejects. Among retained hedges, the research questions on function ask how tokens split across EC and P under this scope, not what functions hedges might serve outside it.</w:t>
       </w:r>
     </w:p>
     <w:p>
@@ -1654,13 +1659,12 @@
           <w:bCs w:val="1"/>
           <w:rtl w:val="0"/>
         </w:rPr>
-        <w:t xml:space="preserve">Epistemic Weight</w:t>
-      </w:r>
-      <w:r>
-        <w:rPr>
-          <w:rtl w:val="0"/>
-        </w:rPr>
-        <w:t xml:space="preserve">, conceptually, is the strength of the writer’s commitment to the truth of a proposition (how certain or tentative the claim is). Operationally, Step 2 first requires a claim: a statement about data, the world, or prior work that evidence could show to be wrong. Aims, directives, and routine procedures are excluded by kind. The Working Test then asks whether removing the device raises that claim’s epistemic weight (EC). The Reader Test asks whether epistemic weight stays the same but the claim reaches the reader more bluntly or the writer takes sole ownership against prior work (P). Non-claims and tokens that meet neither check are logged as FP.</w:t>
+        <w:t>Epistemic Weight, conceptually, is the strength of the writer’s commitment to the truth of a proposition (how certain or tentative the claim is). Operationally, Step 2 first requires a claim: a statement about data, the world, or prior work that evidence could show to be wrong. Aims, directives, and routine procedures are excluded by kind. The Working Test then asks whether removing the device raises that claim’s epistemic weight (EC). The Reader Test asks whether epistemic weight stays the same but the claim reaches the reader more bluntly or the writer takes sole ownership against prior work (P). When a token both reduces commitment and softens interpersonal force, it is coded EC with a concurrent P reading under the Working Test path, not as two independent test passes. Non-claims and tokens that meet neither check are logged as FP.</w:t>
+      </w:r>
+      <w:r>
+        <w:rPr>
+          <w:rtl w:val="0"/>
+        </w:rPr>
       </w:r>
     </w:p>
     <w:p>
@@ -4303,7 +4307,20 @@
           <w:strike w:val="0"/>
           <w:rtl w:val="0"/>
         </w:rPr>
-        <w:t xml:space="preserve">Table 2 presents the overall distribution of hedge types. Lexical hedges dominated the corpus with 42 instances (64.6%), followed by modal verbs with 20 instances (30.8%), and adverbial hedges with 3 instances (4.7%). No clause-level hedges were identified in any of the 60 abstracts. The literature reports modal verbs as the most frequent hedge type in developing researchers' writing (Khunasathitchai et al., 2025; Wang, 2022). This corpus differs: lexical hedges outnumber modal verbs.</w:t>
+        <w:t xml:space="preserve">Table 2 presents the overall distribution of hedge types. Lexical hedges dominated the corpus with 42 instances (64.6%), followed by modal verbs with 20 instances (30.8%), and adverbial hedges with 3 instances (4.</w:t>
+      </w:r>
+      <w:r>
+        <w:rPr>
+          <w:rtl w:val="0"/>
+        </w:rPr>
+        <w:t xml:space="preserve">6</w:t>
+      </w:r>
+      <w:r>
+        <w:rPr>
+          <w:strike w:val="0"/>
+          <w:rtl w:val="0"/>
+        </w:rPr>
+        <w:t xml:space="preserve">%). No clause-level hedges were identified in any of the 60 abstracts. The literature reports modal verbs as the most frequent hedge type in developing researchers' writing (Khunasathitchai et al., 2025; Wang, 2022). This corpus differs: lexical hedges outnumber modal verbs.</w:t>
       </w:r>
       <w:r>
         <w:rPr>
@@ -4323,7 +4340,33 @@
           <w:strike w:val="0"/>
           <w:rtl w:val="0"/>
         </w:rPr>
-        <w:t xml:space="preserve">Within the lexical hedge category, the token “potential” accounted for 19 of the 42 lexical instances (45.2%), the single most frequent hedge token in the corpus. Other frequent lexical forms, grouped by root, included “suggest / suggests / suggesting” (13), “imply / implies / implying” (3), and “indicating / indicates” (3). Modal verbs were led by “could” (6), “may” (6), “can” (5), and “might” (3). The 19 potential instances show recurring frames such as “the potential of X as a Y,” “has potential as an X,” and “highlight their potential as X.” Whether those uses express epistemic caution or topic-naming evaluation remains a boundary judgment under the Working Test and is open to alternative readings. Without these 19 tokens, lexical hedges number 22 against 21 modal verbs, so the lexical lead rests on how “potential” is read. Agriculture and Biology account for 15 of the 19 instances. Veterinary Medicine accounts for 4. In scientific English, however, content-oriented lexical hedges often carry more of the epistemic load than modals alone (Hyland, 1998). The dominance of potential fits that pattern in applied-life-science abstracts. Writers reach for a ready English formula that softens application claims (“has potential as…”, “highlight their potential as…”) without building longer clause-level stance. Related work on scientific research writing supports a lexical emphasis. Hyland (1996a) shows that hedging in molecular biology articles is realized mainly by surface lexical forms, with epistemic lexical verbs the largest and most varied group and items such as suggest and indicate among the most frequent. Biologists in that corpus also used fewer modal verbs than writers in general academic English. The present lexical-led profile, driven by potential and suggest in application and implication frames, therefore aligns more with the scientific pattern than with the modal-heavy student pattern.</w:t>
+        <w:t xml:space="preserve">Within the lexical hedge category, the token “potential” accounted for 19 of the 42 lexical instances (45.2%), the single most frequent hedge token in the corpus. Other frequent lexical forms, grouped by root, included “suggest / suggests / suggesting” (13), “imply / implies / implying” (3), and “indicating / indicates” (3). Modal verbs were led by “could” (6), “may” (6), “can” (5), and “might” (3). The 19 potential instances show recurring frames such as “the potential of X as a Y,” “has potential as an X,” and “highlight their potential as X.” Whether those uses express epistemic caution or topic-naming evaluation remains a boundary judgment under the Working Test and is open to alternative readings. Without these 19 tokens, lexical hedges number 2</w:t>
+      </w:r>
+      <w:r>
+        <w:rPr>
+          <w:rtl w:val="0"/>
+        </w:rPr>
+        <w:t xml:space="preserve">3</w:t>
+      </w:r>
+      <w:r>
+        <w:rPr>
+          <w:strike w:val="0"/>
+          <w:rtl w:val="0"/>
+        </w:rPr>
+        <w:t xml:space="preserve"> against 2</w:t>
+      </w:r>
+      <w:r>
+        <w:rPr>
+          <w:rtl w:val="0"/>
+        </w:rPr>
+        <w:t xml:space="preserve">0</w:t>
+      </w:r>
+      <w:r>
+        <w:rPr>
+          <w:strike w:val="0"/>
+          <w:rtl w:val="0"/>
+        </w:rPr>
+        <w:t xml:space="preserve"> modal verbs, so the lexical lead rests on how “potential” is read. Agriculture and Biology account for 15 of the 19 instances. Veterinary Medicine accounts for 4. In scientific English, however, content-oriented lexical hedges often carry more of the epistemic load than modals alone (Hyland, 1998). The dominance of potential fits that pattern in applied-life-science abstracts. Writers reach for a ready English formula that softens application claims (“has potential as…”, “highlight their potential as…”) without building longer clause-level stance. Related work on scientific research writing supports a lexical emphasis. Hyland (1996a) shows that hedging in molecular biology articles is realized mainly by surface lexical forms, with epistemic lexical verbs the largest and most varied group and items such as suggest and indicate among the most frequent. Biologists in that corpus also used fewer modal verbs than writers in general academic English. The present lexical-led profile, driven by potential and suggest in application and implication frames, therefore aligns more with the scientific pattern than with the modal-heavy student pattern.</w:t>
       </w:r>
       <w:r>
         <w:rPr>
@@ -5997,7 +6040,20 @@
           <w:strike w:val="0"/>
           <w:rtl w:val="0"/>
         </w:rPr>
-        <w:t xml:space="preserve">Table 3 lists every retained hedge form in the corpus with its grammatical type and count. Counts sum to 64. Surface forms of the same root are listed separately here so each tally line can be checked against the coding sheet.</w:t>
+        <w:t xml:space="preserve">Table 3 lists every retained hedge form in the corpus with its grammatical type and count. Counts sum to 6</w:t>
+      </w:r>
+      <w:r>
+        <w:rPr>
+          <w:rtl w:val="0"/>
+        </w:rPr>
+        <w:t xml:space="preserve">5</w:t>
+      </w:r>
+      <w:r>
+        <w:rPr>
+          <w:strike w:val="0"/>
+          <w:rtl w:val="0"/>
+        </w:rPr>
+        <w:t xml:space="preserve">. Surface forms of the same root are listed separately here so each tally line can be checked against the coding sheet.</w:t>
       </w:r>
       <w:r>
         <w:rPr>
@@ -6977,7 +7033,59 @@
           <w:strike w:val="0"/>
           <w:rtl w:val="0"/>
         </w:rPr>
-        <w:t xml:space="preserve">Table 4 shows that Agriculture has a balanced type mix (13 modal verbs, 50.0% vs. 13 lexical hedges, 50.0%), while Biology is heavily lexical (20 of 28 hedges, 71.4%, with only 5 modal verbs). Veterinary Medicine, with only 10 total hedges, is also predominantly lexical (8 of 10, 80.0%). Agriculture is the only discipline in which modal verbs reach half of the hedge tokens. That contrast is real in the counts, but the Ag-Bio difference in overall density is marginal and outlier-sensitive (Part II), so type-mix differences should not be read as a stable Agriculture-versus-Biology profile. The near-absence of adverbial hedges across all three disciplines (only 3 instances, all in Biology) points instead to a shared, narrow repertoire.</w:t>
+        <w:t xml:space="preserve">Table 4 shows that Agriculture has a balanced type mix (13 modal verbs, </w:t>
+      </w:r>
+      <w:r>
+        <w:rPr>
+          <w:rtl w:val="0"/>
+        </w:rPr>
+        <w:t xml:space="preserve">48.1</w:t>
+      </w:r>
+      <w:r>
+        <w:rPr>
+          <w:strike w:val="0"/>
+          <w:rtl w:val="0"/>
+        </w:rPr>
+        <w:t xml:space="preserve">% vs. 1</w:t>
+      </w:r>
+      <w:r>
+        <w:rPr>
+          <w:rtl w:val="0"/>
+        </w:rPr>
+        <w:t xml:space="preserve">4</w:t>
+      </w:r>
+      <w:r>
+        <w:rPr>
+          <w:strike w:val="0"/>
+          <w:rtl w:val="0"/>
+        </w:rPr>
+        <w:t xml:space="preserve"> lexical hedges, 5</w:t>
+      </w:r>
+      <w:r>
+        <w:rPr>
+          <w:rtl w:val="0"/>
+        </w:rPr>
+        <w:t xml:space="preserve">1.9</w:t>
+      </w:r>
+      <w:r>
+        <w:rPr>
+          <w:strike w:val="0"/>
+          <w:rtl w:val="0"/>
+        </w:rPr>
+        <w:t xml:space="preserve">%), while Biology is heavily lexical (20 of 28 hedges, 71.4%, with only 5 modal verbs). Veterinary Medicine, with only 10 total hedges, is also predominantly lexical (8 of 10, 80.0%). Agriculture is the only discipline in which modal verbs </w:t>
+      </w:r>
+      <w:r>
+        <w:rPr>
+          <w:rtl w:val="0"/>
+        </w:rPr>
+        <w:t xml:space="preserve">come close to</w:t>
+      </w:r>
+      <w:r>
+        <w:rPr>
+          <w:strike w:val="0"/>
+          <w:rtl w:val="0"/>
+        </w:rPr>
+        <w:t xml:space="preserve"> half of the hedge tokens. That contrast is real in the counts, but the Ag-Bio difference in overall density is marginal and outlier-sensitive (Part II), so type-mix differences should not be read as a stable Agriculture-versus-Biology profile. The near-absence of adverbial hedges across all three disciplines (only 3 instances, all in Biology) points instead to a shared, narrow repertoire.</w:t>
       </w:r>
       <w:r>
         <w:rPr>
@@ -7011,7 +7119,33 @@
           <w:strike w:val="0"/>
           <w:rtl w:val="0"/>
         </w:rPr>
-        <w:t xml:space="preserve">Alongside the 65 retained EC hedges (and P = 0), the corpus yielded 65 false positive tokens, hedge-like words that failed the claim condition or both removal checks at Step 2. Table 6 (Part III) places these totals side by side. The false positive breakdown shows FP-Gen (general exclusion, including topic-naming and evidential pointers) at 33 instances, FP-Rec (recommendations) at 15, FP-Proc (procedural norms) at 2, and FP-Cap (capability) at 8. The high number of FP-Gen tokens reflects topic-naming potential and similar non-claim frames rather than a pre-filter applied before Step 2.. The false positive breakdown shows FP-Gen (general exclusion, including topic-naming and evidential pointers) at 33 instances, FP-Rec (recommendations) at 15, FP-Proc (procedural norms) at 2, and FP-Cap (capability) at 8. The high number of FP-Gen tokens reflects topic-naming potential and similar non-claim frames rather than a pre-filter applied before Step 2.</w:t>
+        <w:t xml:space="preserve">Alongside the 65 retained EC hedges (and P = 0), the corpus yielded 65 false positive tokens, hedge-like words that failed the claim condition or both removal checks at Step 2. Table 6 (Part III) places these totals side by side. The false positive breakdown shows FP-Gen (general exclusion, including topic-naming and evidential pointers) at 3</w:t>
+      </w:r>
+      <w:r>
+        <w:rPr>
+          <w:rtl w:val="0"/>
+        </w:rPr>
+        <w:t xml:space="preserve">9</w:t>
+      </w:r>
+      <w:r>
+        <w:rPr>
+          <w:strike w:val="0"/>
+          <w:rtl w:val="0"/>
+        </w:rPr>
+        <w:t xml:space="preserve"> instances, FP-Rec (recommendations) at 15, FP-Proc (procedural norms) at 2, and FP-Cap (capability) at </w:t>
+      </w:r>
+      <w:r>
+        <w:rPr>
+          <w:rtl w:val="0"/>
+        </w:rPr>
+        <w:t xml:space="preserve">9</w:t>
+      </w:r>
+      <w:r>
+        <w:rPr>
+          <w:strike w:val="0"/>
+          <w:rtl w:val="0"/>
+        </w:rPr>
+        <w:t xml:space="preserve">. The high number of FP-Gen tokens reflects topic-naming potential and similar non-claim frames rather than a pre-filter applied before Step 2.</w:t>
       </w:r>
       <w:r>
         <w:rPr>
@@ -7630,7 +7764,7 @@
                 <w:szCs w:val="18"/>
                 <w:rtl w:val="0"/>
               </w:rPr>
-              <w:t xml:space="preserve">16</w:t>
+              <w:t xml:space="preserve">17</w:t>
             </w:r>
           </w:p>
         </w:tc>
@@ -7840,12 +7974,15 @@
                 <w:szCs w:val="18"/>
                 <w:rtl w:val="0"/>
               </w:rPr>
-              <w:t xml:space="preserve">33</w:t>
-            </w:r>
-            <w:r>
-              <w:rPr>
-                <w:rtl w:val="0"/>
-              </w:rPr>
+              <w:t xml:space="preserve">3</w:t>
+            </w:r>
+            <w:r>
+              <w:rPr>
+                <w:sz w:val="18"/>
+                <w:szCs w:val="18"/>
+                <w:rtl w:val="0"/>
+              </w:rPr>
+              <w:t xml:space="preserve">4</w:t>
             </w:r>
           </w:p>
         </w:tc>
@@ -8062,12 +8199,15 @@
                 <w:szCs w:val="18"/>
                 <w:rtl w:val="0"/>
               </w:rPr>
-              <w:t xml:space="preserve">12</w:t>
-            </w:r>
-            <w:r>
-              <w:rPr>
-                <w:rtl w:val="0"/>
-              </w:rPr>
+              <w:t xml:space="preserve">1</w:t>
+            </w:r>
+            <w:r>
+              <w:rPr>
+                <w:sz w:val="18"/>
+                <w:szCs w:val="18"/>
+                <w:rtl w:val="0"/>
+              </w:rPr>
+              <w:t xml:space="preserve">4</w:t>
             </w:r>
           </w:p>
         </w:tc>
@@ -8426,7 +8566,7 @@
         <w:rPr>
           <w:rtl w:val="0"/>
         </w:rPr>
-        <w:t xml:space="preserve">Per-abstract hedge distributions reveal substantial skew. Agriculture abstracts averaged 1.35 hedges (median = 1, SD = 1.84, range = 0-8), Biology averaged 1.40 (median = 1, SD = 1.31, range = 0-5), and Veterinary Medicine averaged 0.50 (median = 0, SD = 0.76, range = 0-3). The high standard deviation in Agriculture reflects the influence of Acs2, which contained 8 hedges alone. When Acs2 is excluded as a sensitivity check, Agriculture's density drops to 0.46 per 100 words, nearly tied with Biology's 0.62, so that any Agriculture &gt; Biology ranking is partly driven by a single outlier abstract. An exploratory Kruskal-Wallis test on per-abstract hedge rates (per 100 words) yielded H = 7.44, p =.024. Post hoc Mann-Whitney tests on the same rates give Veterinary Medicine versus Biology p =.011, Veterinary Medicine versus Agriculture p =.034, and Agriculture versus Biology p =.72. With a Bonferroni correction for three pairwise tests (α =.017), only the Biology-Veterinary Medicine contrast remains significant. Agriculture and Biology are statistically indistinguishable on this measure. Veterinary Medicine does not differ from Agriculture at the corrected threshold. Abstracts within a program may share advisers, so observations are not fully independent, and within-discipline spread remains larger than the gaps between means. Removing all 19 instances of “potential” leaves 46 hedges. The Kruskal-Wallis contrast remains in the same direction, and Veterinary Medicine’s zero-hedge share rises further. Low density in undergraduate and L2 academic writing is widely reported and is often read as limited stance control rather than as deliberate categorical style (Hyland &amp; Milton, 1997; Qiu et al., 2024). In this PSAU sample, the pairwise contrast that survives correction is Biology versus Veterinary Medicine. It is a local English-language pattern in ratified abstracts. Supervised abstracts may absorb program tolerance for soft claims as much as individual rhetorical choice.</w:t>
+        <w:t xml:space="preserve">Per-abstract hedge distributions reveal substantial skew. Agriculture abstracts averaged 1.35 hedges (median = 1, SD = 1.87, range = 0-8), Biology averaged 1.40 (median = 1, SD = 1.31, range = 0-5), and Veterinary Medicine averaged 0.50 (median = 0, SD = 0.76, range = 0-3). The high standard deviation in Agriculture reflects the influence of Acs2, which contained 8 hedges alone. When Acs2 is excluded as a sensitivity check, Agriculture's density drops to 0.46 per 100 words, nearly tied with Biology's 0.62, so that any Agriculture &gt; Biology ranking is partly driven by a single outlier abstract. An exploratory Kruskal-Wallis test on per-abstract hedge rates (per 100 words) yielded H = 7.47, p =.024. Post hoc Mann-Whitney tests on the same rates give Veterinary Medicine versus Biology p =.011, Veterinary Medicine versus Agriculture p =.034, and Agriculture versus Biology p =.68. With a Bonferroni correction for three pairwise tests (α =.017), only the Biology-Veterinary Medicine contrast remains significant. Agriculture and Biology are statistically indistinguishable on this measure. Veterinary Medicine does not differ from Agriculture at the corrected threshold. Abstracts within a program may share advisers, so observations are not fully independent, and within-discipline spread remains larger than the gaps between means. Removing all 19 instances of “potential” leaves 46 hedges. The Kruskal-Wallis contrast remains in the same direction, and Veterinary Medicine’s zero-hedge share rises further. Low density in undergraduate and L2 academic writing is widely reported and is often read as limited stance control rather than as deliberate categorical style (Hyland &amp; Milton, 1997; Qiu et al., 2024). In this PSAU sample, the pairwise contrast that survives correction is Biology versus Veterinary Medicine. It is a local English-language pattern in ratified abstracts. Supervised abstracts may absorb program tolerance for soft claims as much as individual rhetorical choice.</w:t>
       </w:r>
     </w:p>
     <w:p>
@@ -8468,7 +8608,7 @@
         <w:rPr>
           <w:rtl w:val="0"/>
         </w:rPr>
-        <w:t xml:space="preserve">The false positive distribution also varies by discipline. Biology produced 32 false positives, far more than Agriculture (14) or Veterinary Medicine (12). This is partly because Biology abstracts contain more instances of “</w:t>
+        <w:t xml:space="preserve">The false positive distribution also varies by discipline. Biology produced 34 false positives, far more than Agriculture (17) or Veterinary Medicine (14). This is partly because Biology abstracts contain more instances of “</w:t>
       </w:r>
       <w:r>
         <w:rPr>
@@ -9046,7 +9186,7 @@
         <w:rPr>
           <w:rtl w:val="0"/>
         </w:rPr>
-        <w:t xml:space="preserve">Gillaerts and Van de Velde (2010) show that research-article abstracts are not miniature full articles. Interactional markers in abstracts have their own make-up, and the degree of interpersonality can be more limited than in the longer text. In this PSAU sample, most retained hedges sit in implication and conclusion sentences rather than in bare results lines. Forms such as potential and suggest/suggests/suggesting qualified applications or interpretations. Results sentences in the same abstracts often use factive verbs (showed, revealed, demonstrated) without qualification. No move-structured count was run, so this is a qualitative reading, but it points to abstracts that report findings directly and hedge mainly where findings turn into meaning. Novice and L2 academic writing further situates the result. Student writers often work with a narrower stance repertoire and lean on classroom habits more than on genre-sensitive interpersonal design (Saengsuwan &amp; Suwannatrai, 2026). In agricultural-science writing, L2 students have been found to use fewer hedges than expert writers in the same field (Qiu et al., 2024). The present corpus shows a related English-language pattern. When hedges were retained, they did epistemic work with a small lexical set. Modal verbs (21 instances, all EC) almost exclusively marked possibility about results or implications, while Lexical hedges (42 instances, all EC) qualified the strength of findings or implications.</w:t>
+        <w:t xml:space="preserve">Gillaerts and Van de Velde (2010) show that research-article abstracts are not miniature full articles. Interactional markers in abstracts have their own make-up, and the degree of interpersonality can be more limited than in the longer text. In this PSAU sample, most retained hedges sit in implication and conclusion sentences rather than in bare results lines. Forms such as potential and suggest/suggests/suggesting qualified applications or interpretations. Results sentences in the same abstracts often use factive verbs (showed, revealed, demonstrated) without qualification. No move-structured count was run, so this is a qualitative reading, but it points to abstracts that report findings directly and hedge mainly where findings turn into meaning. Novice and L2 academic writing further situates the result. Student writers often work with a narrower stance repertoire and lean on classroom habits more than on genre-sensitive interpersonal design (Saengsuwan &amp; Suwannatrai, 2026). In agricultural-science writing, L2 students have been found to use fewer hedges than expert writers in the same field (Qiu et al., 2024). The present corpus shows a related English-language pattern. When hedges were retained, they did epistemic work with a small lexical set. Modal verbs (20 instances, all EC) almost exclusively marked possibility about results or implications, while Lexical hedges (42 instances, all EC) qualified the strength of findings or implications.</w:t>
       </w:r>
     </w:p>
     <w:p>
@@ -12391,14 +12531,13 @@
           <w:bCs w:val="1"/>
           <w:rtl w:val="0"/>
         </w:rPr>
-        <w:t xml:space="preserve">• Step 2. </w:t>
+        <w:t>• Step 2. Claim condition: the device must attach to a claim (a statement about data, the world, or prior work that evidence could show to be wrong). Aims, directives, and routine procedures are excluded by kind. If not a claim, log FP with a reason code. Working Test: remove the device. If commitment to the claim’s truth rises → EC. Reader Test: remove the device. If truth commitment stays the same but the claim is blunter to the reader or the writer takes sole ownership against prior work → P. EC and P may be assigned together when commitment rises and the token also softens interpersonal force. In that case record EC with concurrent P. Neither test met → FP.</w:t>
       </w:r>
       <w:r>
         <w:rPr>
           <w:rFonts w:ascii="Cardo" w:cs="Cardo" w:eastAsia="Cardo" w:hAnsi="Cardo"/>
           <w:rtl w:val="0"/>
         </w:rPr>
-        <w:t xml:space="preserve">Claim condition: the device must attach to a claim (a statement about data, the world, or prior work that evidence could show to be wrong). Aims, directives, and routine procedures are excluded by kind. If not a claim, log FP with a reason code. Working Test: remove the device. If commitment to the claim’s truth rises → EC. Reader Test: remove the device. If truth commitment stays the same but the claim is blunter to the reader or the writer takes sole ownership against prior work → P. Neither → FP. </w:t>
       </w:r>
     </w:p>
     <w:p>
@@ -19155,18 +19294,40 @@
         <w:rPr>
           <w:strike w:val="0"/>
           <w:color w:val="000000"/>
-          <w:shd w:fill="bfbfbf" w:val="clear"/>
           <w:rtl w:val="0"/>
         </w:rPr>
         <w:t xml:space="preserve">was</w:t>
       </w:r>
       <w:r>
         <w:rPr>
-          <w:strike w:val="0"/>
-          <w:color w:val="000000"/>
-          <w:rtl w:val="0"/>
-        </w:rPr>
-        <w:t xml:space="preserve"> [G] used, starting with UCO to SUPs 1:1 as treatment 1, a decreasing ratio of UCO to SUPs. At equal parts by weight of UCO and SUPs, optimization started at Treatment 1 with a 1:1 ratio. Treatments 2–5 proceeded similarly, increasing the ratio of UCO to SUPs. Density measurements, water absorption, and drop tests were all performed and observed. A self-testing protocol based on current literature was used. The density was calculated relative to mass and volume; however, the water absorption test yielded inconsistent findings. A drop test was also performed, which revealed that the eco-bricks from all treatments were significantly damaged at the height of one meter, making them a weak, unsuitable material to use in building walkways. This study is essential for getting insights into eco-brick manufacture because the workability of SUPs and UCOs as raw materials is proven. The research findings do not apply to buildings. Therefore, further research </w:t>
+          <w:rtl w:val="0"/>
+        </w:rPr>
+        <w:t xml:space="preserve"> </w:t>
+      </w:r>
+      <w:r>
+        <w:rPr>
+          <w:strike w:val="0"/>
+          <w:color w:val="000000"/>
+          <w:rtl w:val="0"/>
+        </w:rPr>
+        <w:t xml:space="preserve">used, starting with UCO to SUPs 1:1 as treatment 1, a decreasing ratio of UCO to SUPs. At equal parts by weight of UCO and SUPs, optimization started at Treatment 1 with a 1:1 ratio. Treatments 2–5 proceeded similarly, increasing the ratio of UCO to SUPs. Density measurements, water absorption, and drop tests were all performed and observed. A self-testing protocol based on current literature was used. The density was calculated relative to mass and volume; however, the water absorption test yielded inconsistent findings. A drop test was also performed, which </w:t>
+      </w:r>
+      <w:r>
+        <w:rPr>
+          <w:strike w:val="0"/>
+          <w:color w:val="000000"/>
+          <w:shd w:fill="b7b7b7" w:val="clear"/>
+          <w:rtl w:val="0"/>
+        </w:rPr>
+        <w:t xml:space="preserve">revealed</w:t>
+      </w:r>
+      <w:r>
+        <w:rPr>
+          <w:strike w:val="0"/>
+          <w:color w:val="000000"/>
+          <w:rtl w:val="0"/>
+        </w:rPr>
+        <w:t xml:space="preserve"> [G] that the eco-bricks from all treatments were significantly damaged at the height of one meter, making them a weak, unsuitable material to use in building walkways. This study is essential for getting insights into eco-brick manufacture because the workability of SUPs and UCOs as raw materials is proven. The research findings do not apply to buildings. Therefore, further research </w:t>
       </w:r>
       <w:r>
         <w:rPr>
@@ -19818,7 +19979,15 @@
         <w:rPr>
           <w:strike w:val="0"/>
           <w:color w:val="000000"/>
-          <w:shd w:fill="bfbfbf" w:val="clear"/>
+          <w:rtl w:val="0"/>
+        </w:rPr>
+        <w:t xml:space="preserve">was evaluated through spectrophotometric and turbidimetric analyses for the initial screening of gut isolates. Nine out of ten isolates exhibit quorum quenching activities by inhibiting the swarming motility of Pseudomonas aeruginosa. The metabolic compounds of the isolates were subjected to initial characterization using enzyme and pH neutralization, which revealed that organic acids were responsible for the inhibitory activity. The inhibition activity of LAB isolates against the quorum sensing-mediated swarming motility in P. aeruginosa </w:t>
+      </w:r>
+      <w:r>
+        <w:rPr>
+          <w:strike w:val="0"/>
+          <w:color w:val="000000"/>
+          <w:shd w:fill="b7b7b7" w:val="clear"/>
           <w:rtl w:val="0"/>
         </w:rPr>
         <w:t xml:space="preserve">was</w:t>
@@ -19829,7 +19998,7 @@
           <w:color w:val="000000"/>
           <w:rtl w:val="0"/>
         </w:rPr>
-        <w:t xml:space="preserve"> [C] evaluated through spectrophotometric and turbidimetric analyses for the initial screening of gut isolates. Nine out of ten isolates exhibit quorum quenching activities by inhibiting the swarming motility of Pseudomonas aeruginosa. The metabolic compounds of the isolates were subjected to initial characterization using enzyme and pH neutralization, which revealed that organic acids were responsible for the inhibitory activity. The inhibition activity of LAB isolates against the quorum sensing-mediated swarming motility in P. aeruginosa was due to strong antibacterial activity.</w:t>
+        <w:t xml:space="preserve"> [C] due to strong antibacterial activity.</w:t>
       </w:r>
       <w:r>
         <w:rPr>
@@ -21014,7 +21183,15 @@
         <w:rPr>
           <w:strike w:val="0"/>
           <w:color w:val="000000"/>
-          <w:shd w:fill="bfbfbf" w:val="clear"/>
+          <w:rtl w:val="0"/>
+        </w:rPr>
+        <w:t xml:space="preserve">was conducted to determine the anesthetic effect of Zoletil® in zebrafish (Danio rerio). A total of 25 zebrafish with similar body sizes were used for three treatments. Treatment 1 was Zoletil® waterbath. The dosage started at 10mg/L and it continued to increase by 10mg/L with a maximum of 50 mg/L. Stage 1 of anesthesia was observed in T1, but it did not progress to Stage 2 and Stage 3 of anesthesia. Treatment 2 was waterbath mixed with Sodium bicarbonate. The dosage that was used started at 20 g/L. In dosages 20 g/L and 30 g/L, Stage 1 and Stage 2 anesthesia was observed, but it failed to induce Stage 3. Whereas dosages 40 g/L, 50 g/L, and 60 g/L were able to induce all three stages of anesthesia, Treatment 3 was a combination of Zoletil® and sodium bicarbonate. In dosage of 5 mg/L of Zoletil® and 30 g/L of sodium bicarbonate, Stage 3 was observed. T1 revealed that Zoletil® alone is not enough to fully induce Stage 3 anesthesia in zebrafish. However, when sodium bicarbonate was added, Stage 3 </w:t>
+      </w:r>
+      <w:r>
+        <w:rPr>
+          <w:strike w:val="0"/>
+          <w:color w:val="000000"/>
+          <w:shd w:fill="b7b7b7" w:val="clear"/>
           <w:rtl w:val="0"/>
         </w:rPr>
         <w:t xml:space="preserve">was</w:t>
@@ -21025,7 +21202,7 @@
           <w:color w:val="000000"/>
           <w:rtl w:val="0"/>
         </w:rPr>
-        <w:t xml:space="preserve"> [C] conducted to determine the anesthetic effect of Zoletil® in zebrafish (Danio rerio). A total of 25 zebrafish with similar body sizes were used for three treatments. Treatment 1 was Zoletil® waterbath. The dosage started at 10mg/L and it continued to increase by 10mg/L with a maximum of 50 mg/L. Stage 1 of anesthesia was observed in T1, but it did not progress to Stage 2 and Stage 3 of anesthesia. Treatment 2 was waterbath mixed with Sodium bicarbonate. The dosage that was used started at 20 g/L. In dosages 20 g/L and 30 g/L, Stage 1 and Stage 2 anesthesia was observed, but it failed to induce Stage 3. Whereas dosages 40 g/L, 50 g/L, and 60 g/L were able to induce all three stages of anesthesia, Treatment 3 was a combination of Zoletil® and sodium bicarbonate. In dosage of 5 mg/L of Zoletil® and 30 g/L of sodium bicarbonate, Stage 3 was observed. T1 revealed that Zoletil® alone is not enough to fully induce Stage 3 anesthesia in zebrafish. However, when sodium bicarbonate was added, Stage 3 was achieved, while using only a small amount of Zoletil®. Additionally, it was also revealed that 40 g/L of sodium bicarbonate was sufficient to induce Stage 3 anesthesia in zebrafish.</w:t>
+        <w:t xml:space="preserve"> [C] achieved, while using only a small amount of Zoletil®. Additionally, it was also revealed that 40 g/L of sodium bicarbonate was sufficient to induce Stage 3 anesthesia in zebrafish.</w:t>
       </w:r>
       <w:r>
         <w:rPr>
@@ -21188,7 +21365,15 @@
         <w:rPr>
           <w:strike w:val="0"/>
           <w:color w:val="000000"/>
-          <w:shd w:fill="bfbfbf" w:val="clear"/>
+          <w:rtl w:val="0"/>
+        </w:rPr>
+        <w:t xml:space="preserve">showed resistance to meropenem. On the other hand, the evaluation of retail egg vendors </w:t>
+      </w:r>
+      <w:r>
+        <w:rPr>
+          <w:strike w:val="0"/>
+          <w:color w:val="000000"/>
+          <w:shd w:fill="b7b7b7" w:val="clear"/>
           <w:rtl w:val="0"/>
         </w:rPr>
         <w:t xml:space="preserve">showed</w:t>
@@ -21199,7 +21384,7 @@
           <w:color w:val="000000"/>
           <w:rtl w:val="0"/>
         </w:rPr>
-        <w:t xml:space="preserve"> [C] resistance to meropenem. On the other hand, the evaluation of retail egg vendors showed a major issue of reusing the egg trays across vendors which has been strongly linked to bacterial growth on eggshells, yolks and albumen, with p-values of 0.030 and 0.014, respectively. The findings </w:t>
+        <w:t xml:space="preserve"> [C] a major issue of reusing the egg trays across vendors which has been strongly linked to bacterial growth on eggshells, yolks and albumen, with p-values of 0.030 and 0.014, respectively. The findings </w:t>
       </w:r>
       <w:r>
         <w:rPr>
@@ -23504,7 +23689,15 @@
         <w:rPr>
           <w:strike w:val="0"/>
           <w:color w:val="000000"/>
-          <w:shd w:fill="bfbfbf" w:val="clear"/>
+          <w:rtl w:val="0"/>
+        </w:rPr>
+        <w:t xml:space="preserve">was conducted from January 2023 to April 2023 at [REDACTED] to evaluate the performance of rice as supplemented with foliar fertilizer. The experimental design used is a randomized complete block design (RCBD) with three treatments replicated three times. The following treatments were used: T1: recommended rate of NPK based on soil analysis; T2: recommended rate of NPK + 19-19-19; and T3: recommended rate of NPK + 14-14-14. The results of the study revealed the following: a significant difference was observed in the number of productive tillers, actual yield per sample area, and computed yield per ton/ha. No significant differences were observed in terms of the number of days from transplanting to flowering, plant height, number of unproductive tillers, length of panicle, number of filled grains, number of unfilled grains, and weight of 1,000 seeds. In conclusion, T3: NPK+14-14-14 </w:t>
+      </w:r>
+      <w:r>
+        <w:rPr>
+          <w:strike w:val="0"/>
+          <w:color w:val="000000"/>
+          <w:shd w:fill="b7b7b7" w:val="clear"/>
           <w:rtl w:val="0"/>
         </w:rPr>
         <w:t xml:space="preserve">was</w:t>
@@ -23515,7 +23708,7 @@
           <w:color w:val="000000"/>
           <w:rtl w:val="0"/>
         </w:rPr>
-        <w:t xml:space="preserve"> [G] conducted from January 2023 to April 2023 at [REDACTED] to evaluate the performance of rice as supplemented with foliar fertilizer. The experimental design used is a randomized complete block design (RCBD) with three treatments replicated three times. The following treatments were used: T1: recommended rate of NPK based on soil analysis; T2: recommended rate of NPK + 19-19-19; and T3: recommended rate of NPK + 14-14-14. The results of the study revealed the following: a significant difference was observed in the number of productive tillers, actual yield per sample area, and computed yield per ton/ha. No significant differences were observed in terms of the number of days from transplanting to flowering, plant height, number of unproductive tillers, length of panicle, number of filled grains, number of unfilled grains, and weight of 1,000 seeds. In conclusion, T3: NPK+14-14-14 was the most compelling treatment among all treatments in terms of producing the highest number of productive tillers and obtaining the heaviest yield per ton/ha. Cost and return analysis revealed that T3: NPK+14-14-14 had the second lowest cost of production but had the highest net income, with a corresponding amount of Php 66,089 and an ROI of 97.53%. On the other hand, insignificant differences were noted in terms of the number of days from transplanting to flowering, plant height, number of unproductive tillers, length of panicle, number of filled grains, number of unfilled grains, and weight of 1,000 seeds.</w:t>
+        <w:t xml:space="preserve"> [G] the most compelling treatment among all treatments in terms of producing the highest number of productive tillers and obtaining the heaviest yield per ton/ha. Cost and return analysis revealed that T3: NPK+14-14-14 had the second lowest cost of production but had the highest net income, with a corresponding amount of Php 66,089 and an ROI of 97.53%. On the other hand, insignificant differences were noted in terms of the number of days from transplanting to flowering, plant height, number of unproductive tillers, length of panicle, number of filled grains, number of unfilled grains, and weight of 1,000 seeds.</w:t>
       </w:r>
       <w:r>
         <w:rPr>
@@ -23584,13 +23777,13 @@
           <w:color w:val="000000"/>
           <w:rtl w:val="0"/>
         </w:rPr>
-        <w:t xml:space="preserve">The field </w:t>
-      </w:r>
-      <w:r>
-        <w:rPr>
-          <w:strike w:val="0"/>
-          <w:color w:val="000000"/>
-          <w:shd w:fill="bfbfbf" w:val="clear"/>
+        <w:t xml:space="preserve">The field was conducted for 35 days from April 6, to May 10, 2023 in [REDACTED], [REDACTED] to determine the effect of feeding para grass mixed with varying levels of Gmelina arborea on the growth performance of rabbits. The experimental design used was a randomized complete block design (RCBD) with three treatments replicated three times. The following treatments were used: T1 ([Control] 60% Para grass + 40% Concentrate Feeds), T2 (20% GA Leaves + 40% Para grass + 40% Concentrate Feeds), and T3 (30% GA Leaves + 30% Para grass + 40% Concentrate Feeds). The results of the study revealed the following: No significant differences were observed in terms of mean initial weight (kg), mean final weight (kg), mean gain in weight (kg), mean DM intake (kg), or feed conversion ratio. The student researcher concluded that T2 (20% GA Leaves + 40% Paragrass + 40% Concentrate Feeds) </w:t>
+      </w:r>
+      <w:r>
+        <w:rPr>
+          <w:strike w:val="0"/>
+          <w:color w:val="000000"/>
+          <w:shd w:fill="b7b7b7" w:val="clear"/>
           <w:rtl w:val="0"/>
         </w:rPr>
         <w:t xml:space="preserve">was</w:t>
@@ -23601,7 +23794,7 @@
           <w:color w:val="000000"/>
           <w:rtl w:val="0"/>
         </w:rPr>
-        <w:t xml:space="preserve"> [G] conducted for 35 days from April 6, to May 10, 2023 in [REDACTED], [REDACTED] to determine the effect of feeding para grass mixed with varying levels of Gmelina arborea on the growth performance of rabbits. The experimental design used was a randomized complete block design (RCBD) with three treatments replicated three times. The following treatments were used: T1 ([Control] 60% Para grass + 40% Concentrate Feeds), T2 (20% GA Leaves + 40% Para grass + 40% Concentrate Feeds), and T3 (30% GA Leaves + 30% Para grass + 40% Concentrate Feeds). The results of the study revealed the following: No significant differences were observed in terms of mean initial weight (kg), mean final weight (kg), mean gain in weight (kg), mean DM intake (kg), or feed conversion ratio. The student researcher concluded that T2 (20% GA Leaves + 40% Paragrass + 40% Concentrate Feeds) was the most compelling treatment among all treatments for the rabbits in terms of outperforming the data numerically. The 20% Gmelina arborea + 40% Para grass + 40% Concentrate Feeds greatly contributed to performances in terms of obtaining the highest mean final weight, mean gain in weight, and highest net income.</w:t>
+        <w:t xml:space="preserve"> [G] the most compelling treatment among all treatments for the rabbits in terms of outperforming the data numerically. The 20% Gmelina arborea + 40% Para grass + 40% Concentrate Feeds greatly contributed to performances in terms of obtaining the highest mean final weight, mean gain in weight, and highest net income.</w:t>
       </w:r>
       <w:r>
         <w:rPr>
@@ -24063,7 +24256,15 @@
         <w:rPr>
           <w:strike w:val="0"/>
           <w:color w:val="000000"/>
-          <w:shd w:fill="bfbfbf" w:val="clear"/>
+          <w:rtl w:val="0"/>
+        </w:rPr>
+        <w:t xml:space="preserve">was Treatment 3 (sand paper method). It was found to have a significant effect on the growth and germination rate of pigeon pea in terms of days to germinate, plant height, a number of leaves, and length of leaves. Sulfuric </w:t>
+      </w:r>
+      <w:r>
+        <w:rPr>
+          <w:strike w:val="0"/>
+          <w:color w:val="000000"/>
+          <w:shd w:fill="b7b7b7" w:val="clear"/>
           <w:rtl w:val="0"/>
         </w:rPr>
         <w:t xml:space="preserve">was</w:t>
@@ -24074,7 +24275,7 @@
           <w:color w:val="000000"/>
           <w:rtl w:val="0"/>
         </w:rPr>
-        <w:t xml:space="preserve"> [G] Treatment 3 (sand paper method). It was found to have a significant effect on the growth and germination rate of pigeon pea in terms of days to germinate, plant height, a number of leaves, and length of leaves. Sulfuric was second in terms of the scarification method effectiveness for pigeon pea, The study treatments overall proclaimed a not significant results based from the analyzed data from each treatments except from these group of data such as from the length of leaves from week 2 and week 3 and the length of roots that are all expressed a highly significant results at 1% level and also the plant height from week 3 that also expressed a significant result at 5% level.</w:t>
+        <w:t xml:space="preserve"> [G] second in terms of the scarification method effectiveness for pigeon pea, The study treatments overall proclaimed a not significant results based from the analyzed data from each treatments except from these group of data such as from the length of leaves from week 2 and week 3 and the length of roots that are all expressed a highly significant results at 1% level and also the plant height from week 3 that also expressed a significant result at 5% level.</w:t>
       </w:r>
       <w:r>
         <w:rPr>

</xml_diff>